<commit_message>
fix(main,gates,tests): close 11 tracked defects with evidence - BOB-141/150/152/154/168/169/182/189/195/197/228 + file BOB-232
BOB-197: boot-time LAN-bind invariant in download-proxy/src/main.py refuses to start unarmed on a non-loopback bind.
BOB-152: vendored submodules excluded from MOCK_PID/ORACLE/KILLPG sweeps only, DANGEROUS_COMBO scope untouched.
BOB-189/150/154/168/169/182/195/141/228: stale-tracker and closure evidence under docs/qa, DB and generated docs synced.
Constitution submodule pointer advanced to eba38e8.

Co-Authored-By: Claude Sonnet 5 <noreply@anthropic.com>
</commit_message>
<xml_diff>
--- a/docs/Fixed.docx
+++ b/docs/Fixed.docx
@@ -2,7 +2,7 @@
 <file path=word/document.xml><?xml version="1.0" encoding="utf-8"?>
 <w:document xmlns:w="http://schemas.openxmlformats.org/wordprocessingml/2006/main" xmlns:m="http://schemas.openxmlformats.org/officeDocument/2006/math" xmlns:r="http://schemas.openxmlformats.org/officeDocument/2006/relationships" xmlns:o="urn:schemas-microsoft-com:office:office" xmlns:v="urn:schemas-microsoft-com:vml" xmlns:w10="urn:schemas-microsoft-com:office:word" xmlns:a="http://schemas.openxmlformats.org/drawingml/2006/main" xmlns:pic="http://schemas.openxmlformats.org/drawingml/2006/picture" xmlns:wp="http://schemas.openxmlformats.org/drawingml/2006/wordprocessingDrawing">
   <w:body>
-    <w:bookmarkStart w:id="173" w:name="fixed-closed-workable-items"/>
+    <w:bookmarkStart w:id="184" w:name="fixed-closed-workable-items"/>
     <w:p>
       <w:pPr>
         <w:pStyle w:val="Heading1"/>
@@ -26,7 +26,7 @@
         <w:t xml:space="preserve"> </w:t>
       </w:r>
       <w:r>
-        <w:t xml:space="preserve">48</w:t>
+        <w:t xml:space="preserve">51</w:t>
       </w:r>
       <w:r>
         <w:t xml:space="preserve"> </w:t>
@@ -42,7 +42,7 @@
         <w:t xml:space="preserve"> </w:t>
       </w:r>
       <w:r>
-        <w:t xml:space="preserve">2026-09-23T09:34:59Z</w:t>
+        <w:t xml:space="preserve">2026-09-23T13:29:46Z</w:t>
       </w:r>
       <w:r>
         <w:t xml:space="preserve"> </w:t>
@@ -31913,7 +31913,1994 @@
       </w:r>
     </w:p>
     <w:bookmarkEnd w:id="172"/>
+    <w:bookmarkStart w:id="173" w:name="Xa3e67580bd8f3362dcf836d407dae50325f7eae"/>
+    <w:p>
+      <w:pPr>
+        <w:pStyle w:val="Heading2"/>
+      </w:pPr>
+      <w:r>
+        <w:t xml:space="preserve">BOB-169 — 286 of 326 exported .html docs are headless pandoc fragments with no DOCTYPE and no charset, so UTF-8 section marks and arrows render as mojibake when opened directly</w:t>
+      </w:r>
+    </w:p>
+    <w:p>
+      <w:pPr>
+        <w:pStyle w:val="FirstParagraph"/>
+      </w:pPr>
+      <w:r>
+        <w:rPr>
+          <w:b/>
+          <w:bCs/>
+        </w:rPr>
+        <w:t xml:space="preserve">Status:</w:t>
+      </w:r>
+      <w:r>
+        <w:t xml:space="preserve"> </w:t>
+      </w:r>
+      <w:r>
+        <w:t xml:space="preserve">Fixed (→ Fixed.md)</w:t>
+      </w:r>
+      <w:r>
+        <w:t xml:space="preserve"> </w:t>
+      </w:r>
+      <w:r>
+        <w:rPr>
+          <w:b/>
+          <w:bCs/>
+        </w:rPr>
+        <w:t xml:space="preserve">Type:</w:t>
+      </w:r>
+      <w:r>
+        <w:t xml:space="preserve"> </w:t>
+      </w:r>
+      <w:r>
+        <w:t xml:space="preserve">Bug</w:t>
+      </w:r>
+      <w:r>
+        <w:t xml:space="preserve"> </w:t>
+      </w:r>
+      <w:r>
+        <w:rPr>
+          <w:b/>
+          <w:bCs/>
+        </w:rPr>
+        <w:t xml:space="preserve">Evidence:</w:t>
+      </w:r>
+      <w:r>
+        <w:t xml:space="preserve"> </w:t>
+      </w:r>
+      <w:r>
+        <w:t xml:space="preserve">docs/qa/BOB-169/closure_evidence_20260923.md</w:t>
+      </w:r>
+      <w:r>
+        <w:t xml:space="preserve"> </w:t>
+      </w:r>
+      <w:r>
+        <w:rPr>
+          <w:b/>
+          <w:bCs/>
+        </w:rPr>
+        <w:t xml:space="preserve">Severity:</w:t>
+      </w:r>
+      <w:r>
+        <w:t xml:space="preserve"> </w:t>
+      </w:r>
+      <w:r>
+        <w:t xml:space="preserve">Medium</w:t>
+      </w:r>
+      <w:r>
+        <w:t xml:space="preserve"> </w:t>
+      </w:r>
+      <w:r>
+        <w:rPr>
+          <w:b/>
+          <w:bCs/>
+        </w:rPr>
+        <w:t xml:space="preserve">Created-By:</w:t>
+      </w:r>
+      <w:r>
+        <w:t xml:space="preserve"> </w:t>
+      </w:r>
+      <w:r>
+        <w:t xml:space="preserve">Claude</w:t>
+      </w:r>
+      <w:r>
+        <w:t xml:space="preserve"> </w:t>
+      </w:r>
+      <w:r>
+        <w:rPr>
+          <w:b/>
+          <w:bCs/>
+        </w:rPr>
+        <w:t xml:space="preserve">Assigned-To:</w:t>
+      </w:r>
+      <w:r>
+        <w:t xml:space="preserve"> </w:t>
+      </w:r>
+      <w:r>
+        <w:t xml:space="preserve">Claude</w:t>
+      </w:r>
+    </w:p>
+    <w:p>
+      <w:pPr>
+        <w:pStyle w:val="BodyText"/>
+      </w:pPr>
+      <w:r>
+        <w:t xml:space="preserve">WHAT. The §11.4.65 markdown-export mandate requires every in-scope doc to ship .html/.pdf twins. 286 of the 326 .html files under docs/ (excluding dist/ and node_modules/) are pandoc FRAGMENTS — they begin at</w:t>
+      </w:r>
+    </w:p>
+    <w:p>
+      <w:pPr>
+        <w:pStyle w:val="BodyText"/>
+      </w:pPr>
+      <w:r>
+        <w:t xml:space="preserve">with no &lt;!DOCTYPE&gt;, no</w:t>
+      </w:r>
+    </w:p>
+    <w:p>
+      <w:pPr>
+        <w:pStyle w:val="BodyText"/>
+      </w:pPr>
+      <w:r>
+        <w:t xml:space="preserve">/</w:t>
+      </w:r>
+    </w:p>
+    <w:p>
+      <w:pPr>
+        <w:pStyle w:val="BodyText"/>
+      </w:pPr>
+      <w:r>
+        <w:t xml:space="preserve">, and critically no</w:t>
+      </w:r>
+    </w:p>
+    <w:p>
+      <w:pPr>
+        <w:pStyle w:val="BodyText"/>
+      </w:pPr>
+      <w:r>
+        <w:t xml:space="preserve">. Census run 2026-08-21.</w:t>
+      </w:r>
+    </w:p>
+    <w:p>
+      <w:pPr>
+        <w:pStyle w:val="BodyText"/>
+      </w:pPr>
+      <w:r>
+        <w:t xml:space="preserve">CONCRETE HARM, measured not assumed. Sample docs/BOBA_DATABASE.html: DOCTYPE 0, charset 0, and 30 lines carrying non-ASCII — the distinct characters present are § — ’ ” ” →. With no charset declaration a browser opening the file directly (file:// or a plain static host sending no charset header) falls back to its default encoding, typically windows-1252, and renders § as Â§ and → as â†’. Those are not incidental characters in this corpus: every constitutional cross-reference in these documents is a § literal, so the mojibake lands on the most load-bearing token in the text. Fragments also carry no viewport meta, so they do not scale on mobile.</w:t>
+      </w:r>
+    </w:p>
+    <w:p>
+      <w:pPr>
+        <w:pStyle w:val="BodyText"/>
+      </w:pPr>
+      <w:r>
+        <w:t xml:space="preserve">HOW IT SURFACED. Chasing a CM-DOCS-CHAIN-ENGINE-VERIFY failure on the features-status context. docs_chain sync regenerated docs/features/Status.{html,docx,pdf} and the HTML diff was 183 insertions / 0 DELETIONS — the body was untouched and a full pandoc preamble was PREPENDED, proving the committed file had been a fragment. Its sibling docs/codegraph/Status.html already began with &lt;!DOCTYPE&gt;, so two derivatives in the same docs_chain config were being produced in different modes. That mismatch is what made verify FAIL, and the gate’s own message (</w:t>
+      </w:r>
+      <w:r>
+        <w:t xml:space="preserve">‘derived docs drift from .md sources’</w:t>
+      </w:r>
+      <w:r>
+        <w:t xml:space="preserve">) misattributes it: the content was not drifting from the source, the generator was inconsistent.</w:t>
+      </w:r>
+    </w:p>
+    <w:p>
+      <w:pPr>
+        <w:pStyle w:val="BodyText"/>
+      </w:pPr>
+      <w:r>
+        <w:t xml:space="preserve">THE DETECTION GAP (§11.4.238). Pre-build invariant 16 CM-MARKDOWN-EXPORT-SYNC PASSED on the whole corpus —</w:t>
+      </w:r>
+      <w:r>
+        <w:t xml:space="preserve"> </w:t>
+      </w:r>
+      <w:r>
+        <w:t xml:space="preserve">‘all in-scope docs have fresh .html/.pdf siblings’</w:t>
+      </w:r>
+      <w:r>
+        <w:t xml:space="preserve">. It checks PRESENCE and FRESHNESS, never VALIDITY, so a 0-byte-preamble fragment satisfies it exactly as a well-formed document does. This was found by reading a failing gate’s diff, not by the regime: a §11.4.238 discovery-channel escape, and the missing check is the interesting half.</w:t>
+      </w:r>
+    </w:p>
+    <w:p>
+      <w:pPr>
+        <w:pStyle w:val="BodyText"/>
+      </w:pPr>
+      <w:r>
+        <w:t xml:space="preserve">ROOT CAUSE IS NOT YET PROVEN (§11.4.6). Two generators exist — scripts/generate_markdown_exports.sh (invoked via workable-items-export.sh) and the docs_chain engine — and they demonstrably disagree on standalone vs fragment mode for the same source. WHICH one emits fragments, and whether it does so always or under specific flags, is NOT established here and must not be assumed. Whoever takes this item determines it by invoking both on one fixture and comparing, before changing either.</w:t>
+      </w:r>
+    </w:p>
+    <w:p>
+      <w:pPr>
+        <w:pStyle w:val="BodyText"/>
+      </w:pPr>
+      <w:r>
+        <w:t xml:space="preserve">ACCEPTANCE. (a) Determine by invocation which generator emits fragments and under what conditions; record it. (b) Make the emitting generator produce standalone documents (charset + viewport at minimum), so the two paths agree — §11.4.251: one artifact should not have two generators that disagree. (c) Regenerate the 286 affected files. (d) Extend CM-MARKDOWN-EXPORT-SYNC (or add a sibling) to assert VALIDITY, not just presence: every exported .html declares a charset. Paired §1.1 mutation — strip the charset from one export and the gate must FAIL. Include a negative control so a legitimately standalone doc does not fire (§11.4.201(1)). (e) Honest boundary: this is about the HTML twins only; the .pdf twins embed their own encoding and are not implicated by this measurement.</w:t>
+      </w:r>
+    </w:p>
+    <w:p>
+      <w:pPr>
+        <w:pStyle w:val="BodyText"/>
+      </w:pPr>
+      <w:r>
+        <w:t xml:space="preserve">ALREADY DONE. docs/features/Status.{html,docx,pdf} regenerated via</w:t>
+      </w:r>
+      <w:r>
+        <w:t xml:space="preserve"> </w:t>
+      </w:r>
+      <w:r>
+        <w:t xml:space="preserve">‘docs_chain sync features-status’</w:t>
+      </w:r>
+      <w:r>
+        <w:t xml:space="preserve"> </w:t>
+      </w:r>
+      <w:r>
+        <w:t xml:space="preserve">(evidence qa-results/docs_chain/20260821T202805Z); verify –all now exits 0. That is 3 of the 289 files; the remaining 286 are untouched.</w:t>
+      </w:r>
+    </w:p>
+    <w:p>
+      <w:pPr>
+        <w:pStyle w:val="BodyText"/>
+      </w:pPr>
+      <w:r>
+        <w:t xml:space="preserve">CORRECTION 2026-08-21 (§11.4.6) — recorded openly rather than quietly edited, per the convention BOB-136’s own body establishes. An earlier revision of this item asserted:</w:t>
+      </w:r>
+      <w:r>
+        <w:t xml:space="preserve"> </w:t>
+      </w:r>
+      <w:r>
+        <w:t xml:space="preserve">“the .pdf twins embed their own encoding and are not implicated by this measurement.”</w:t>
+      </w:r>
+      <w:r>
+        <w:t xml:space="preserve"> </w:t>
+      </w:r>
+      <w:r>
+        <w:t xml:space="preserve">That assertion is FALSE. It was written without probing a single PDF.</w:t>
+      </w:r>
+    </w:p>
+    <w:p>
+      <w:pPr>
+        <w:pStyle w:val="BodyText"/>
+      </w:pPr>
+      <w:r>
+        <w:t xml:space="preserve">Probing docs/BOBA_DATABASE.pdf via pdftotext returns</w:t>
+      </w:r>
+      <w:r>
+        <w:t xml:space="preserve"> </w:t>
+      </w:r>
+      <w:r>
+        <w:t xml:space="preserve">‘Â§ 5’</w:t>
+      </w:r>
+      <w:r>
+        <w:t xml:space="preserve">,</w:t>
+      </w:r>
+      <w:r>
+        <w:t xml:space="preserve"> </w:t>
+      </w:r>
+      <w:r>
+        <w:t xml:space="preserve">‘Jackettâ€™s’</w:t>
+      </w:r>
+      <w:r>
+        <w:t xml:space="preserve"> </w:t>
+      </w:r>
+      <w:r>
+        <w:t xml:space="preserve">and</w:t>
+      </w:r>
+      <w:r>
+        <w:t xml:space="preserve"> </w:t>
+      </w:r>
+      <w:r>
+        <w:t xml:space="preserve">‘â†’</w:t>
+      </w:r>
+      <w:r>
+        <w:t xml:space="preserve"> </w:t>
+      </w:r>
+      <w:r>
+        <w:t xml:space="preserve">— UTF-8 byte sequences (§ = 0xC2 0xA7) decoded as latin-1 — while the SOURCE .md at the corresponding construct is clean UTF-8. So the corruption was introduced during export, not authored.</w:t>
+      </w:r>
+    </w:p>
+    <w:p>
+      <w:pPr>
+        <w:pStyle w:val="BodyText"/>
+      </w:pPr>
+      <w:r>
+        <w:t xml:space="preserve">The PDF case is WORSE than the HTML case, not merely additional. An HTML fragment still holds correct UTF-8 BYTES on disk; a browser told the right encoding renders it correctly, so adding</w:t>
+      </w:r>
+    </w:p>
+    <w:p>
+      <w:pPr>
+        <w:pStyle w:val="BodyText"/>
+      </w:pPr>
+      <w:r>
+        <w:t xml:space="preserve">fixes it with no re-render. In a PDF the mis-decoded characters are baked into the text layer as glyphs — no viewer setting recovers them, and only regeneration from clean source fixes it.</w:t>
+      </w:r>
+    </w:p>
+    <w:p>
+      <w:pPr>
+        <w:pStyle w:val="BodyText"/>
+      </w:pPr>
+      <w:r>
+        <w:t xml:space="preserve">MECHANISM (hypothesis, NOT proven — §11.4.6): the PDF is plausibly rendered FROM the charset-less HTML fragment, so the missing declaration propagates into the PDF pipeline and freezes there. Consistent with both artifacts sharing one root defect, but the pipeline was NOT traced. Establish it by invocation before relying on it.</w:t>
+      </w:r>
+    </w:p>
+    <w:p>
+      <w:pPr>
+        <w:pStyle w:val="BodyText"/>
+      </w:pPr>
+      <w:r>
+        <w:t xml:space="preserve">SCOPE NOT MEASURED: exactly ONE pdf was probed. The 286-file census covered .html only. How many of the ~300 PDFs carry baked mojibake is UNKNOWN and must be COUNTED, not extrapolated from a single sample. Acceptance (e) is therefore REPLACED: it previously scoped PDFs out; it now requires the PDF corpus to be counted and regenerated alongside the HTML.</w:t>
+      </w:r>
+    </w:p>
+    <w:p>
+      <w:pPr>
+        <w:pStyle w:val="BodyText"/>
+      </w:pPr>
+      <w:r>
+        <w:t xml:space="preserve">Evidence: docs/qa/BOB-169/pdf_mojibake_correction_20260821.log</w:t>
+      </w:r>
+    </w:p>
+    <w:p>
+      <w:pPr>
+        <w:pStyle w:val="BodyText"/>
+      </w:pPr>
+      <w:r>
+        <w:t xml:space="preserve">ROOT CAUSE PROVEN 2026-08-21 — acceptance (a) is SATISFIED, do not repeat it. Full evidence: docs/qa/BOB-169/root_cause_proven_20260821.md</w:t>
+      </w:r>
+    </w:p>
+    <w:p>
+      <w:pPr>
+        <w:pStyle w:val="BodyText"/>
+      </w:pPr>
+      <w:r>
+        <w:t xml:space="preserve">THE GENERATOR: scripts/generate_markdown_exports.sh:57 runs</w:t>
+      </w:r>
+      <w:r>
+        <w:t xml:space="preserve"> </w:t>
+      </w:r>
+      <w:r>
+        <w:rPr>
+          <w:rStyle w:val="VerbatimChar"/>
+        </w:rPr>
+        <w:t xml:space="preserve">pandoc -f markdown -t html5 -o "$html" "$md" --metadata title=...</w:t>
+      </w:r>
+      <w:r>
+        <w:t xml:space="preserve"> </w:t>
+      </w:r>
+      <w:r>
+        <w:t xml:space="preserve">with NO –standalone/-s, so pandoc emits a body fragment with no DOCTYPE, no head, and no</w:t>
+      </w:r>
+    </w:p>
+    <w:p>
+      <w:pPr>
+        <w:pStyle w:val="BodyText"/>
+      </w:pPr>
+      <w:r>
+        <w:t xml:space="preserve">. A tell that the flag was intended and lost: –metadata title= is passed on that same line, and a title can only render inside a standalone document’s</w:t>
+      </w:r>
+    </w:p>
+    <w:p>
+      <w:pPr>
+        <w:pStyle w:val="BodyText"/>
+      </w:pPr>
+      <w:r>
+        <w:t xml:space="preserve">— the script computes a title it is structurally unable to emit.</w:t>
+      </w:r>
+    </w:p>
+    <w:p>
+      <w:pPr>
+        <w:pStyle w:val="BodyText"/>
+      </w:pPr>
+      <w:r>
+        <w:t xml:space="preserve">THE TWO BRANCHES DISAGREE, AND THE FALLBACK IS THE CORRECT ONE: the else-branch (python-markdown, used only when pandoc is ABSENT) explicitly writes &lt;!DOCTYPE html&gt;</w:t>
+      </w:r>
+    </w:p>
+    <w:p>
+      <w:pPr>
+        <w:pStyle w:val="BodyText"/>
+      </w:pPr>
+      <w:r>
+        <w:t xml:space="preserve">. So the PREFERRED path is the defective one and a host WITHOUT pandoc produces CORRECT exports. That inversion is why this survived — the defect is invisible on exactly the machines least likely to be treated as degraded.</w:t>
+      </w:r>
+    </w:p>
+    <w:p>
+      <w:pPr>
+        <w:pStyle w:val="BodyText"/>
+      </w:pPr>
+      <w:r>
+        <w:t xml:space="preserve">THE PDF MECHANISM IS NO LONGER A HYPOTHESIS: line 76 runs</w:t>
+      </w:r>
+      <w:r>
+        <w:t xml:space="preserve"> </w:t>
+      </w:r>
+      <w:r>
+        <w:rPr>
+          <w:rStyle w:val="VerbatimChar"/>
+        </w:rPr>
+        <w:t xml:space="preserve">weasyprint "$html" "$pdf"</w:t>
+      </w:r>
+      <w:r>
+        <w:t xml:space="preserve"> </w:t>
+      </w:r>
+      <w:r>
+        <w:t xml:space="preserve">— the PDF is rendered FROM the charset-less fragment, so weasyprint’s encoding fallback bakes the mis-decoded glyphs into the PDF text layer.</w:t>
+      </w:r>
+    </w:p>
+    <w:p>
+      <w:pPr>
+        <w:pStyle w:val="BodyText"/>
+      </w:pPr>
+      <w:r>
+        <w:t xml:space="preserve">CONFIRMED BY A FALSIFIABLE PREDICTION: DOCX takes a THIRD path (line 85, pandoc -t docx direct from markdown, never touching the HTML), so it must be clean if the chain is right. Measured on docs/BOBA_DATABASE.*: .docx = 0 mojibake sequences and 7 clean § characters; .pdf =</w:t>
+      </w:r>
+      <w:r>
+        <w:t xml:space="preserve"> </w:t>
+      </w:r>
+      <w:r>
+        <w:t xml:space="preserve">‘Â§ 5’</w:t>
+      </w:r>
+      <w:r>
+        <w:t xml:space="preserve"> </w:t>
+      </w:r>
+      <w:r>
+        <w:t xml:space="preserve">/</w:t>
+      </w:r>
+      <w:r>
+        <w:t xml:space="preserve"> </w:t>
+      </w:r>
+      <w:r>
+        <w:t xml:space="preserve">‘Jackettâ€™s’</w:t>
+      </w:r>
+      <w:r>
+        <w:t xml:space="preserve"> </w:t>
+      </w:r>
+      <w:r>
+        <w:t xml:space="preserve">/</w:t>
+      </w:r>
+      <w:r>
+        <w:t xml:space="preserve"> </w:t>
+      </w:r>
+      <w:r>
+        <w:t xml:space="preserve">‘â†’</w:t>
+      </w:r>
+      <w:r>
+        <w:t xml:space="preserve">; .html = no DOCTYPE, no charset, 30 non-ASCII lines. The DOCX shares the same source and the same pandoc binary and differs ONLY in not passing through the HTML — isolating the defect to the HTML step and ruling out both a corrupt source and a broken pandoc.</w:t>
+      </w:r>
+    </w:p>
+    <w:p>
+      <w:pPr>
+        <w:pStyle w:val="BodyText"/>
+      </w:pPr>
+      <w:r>
+        <w:t xml:space="preserve">THE FIX IS NOT JUST THE FLAG. The generator is mtime-guarded ([[ ! -f</w:t>
+      </w:r>
+      <w:r>
+        <w:t xml:space="preserve"> </w:t>
+      </w:r>
+      <w:r>
+        <w:t xml:space="preserve">“</w:t>
+      </w:r>
+      <w:r>
+        <w:t xml:space="preserve">$html" || "$</w:t>
+      </w:r>
+      <w:r>
+        <w:t xml:space="preserve">md”</w:t>
+      </w:r>
+      <w:r>
+        <w:t xml:space="preserve"> </w:t>
+      </w:r>
+      <w:r>
+        <w:t xml:space="preserve">-nt</w:t>
+      </w:r>
+      <w:r>
+        <w:t xml:space="preserve"> </w:t>
+      </w:r>
+      <w:r>
+        <w:t xml:space="preserve">“$pdf”</w:t>
+      </w:r>
+      <w:r>
+        <w:t xml:space="preserve"> </w:t>
+      </w:r>
+      <w:r>
+        <w:t xml:space="preserve">]]), measured: a full export run AFTER docs_chain rewrote Status.html standalone did NOT revert it. So adding -s heals a file only when its .md is next touched — the corpus would heal silently, unevenly, over an unbounded period, with no point at which anyone can declare it done. Acceptance (c) therefore requires a FORCED regeneration pass, and HTML must be regenerated BEFORE the PDFs, since regenerating PDFs first re-bakes the same mojibake from the still-broken fragment.</w:t>
+      </w:r>
+    </w:p>
+    <w:p>
+      <w:pPr>
+        <w:pStyle w:val="BodyText"/>
+      </w:pPr>
+      <w:r>
+        <w:t xml:space="preserve">DELIBERATELY NOT FIXED IN THIS PASS. The flag is one character but the regeneration is ~286 HTML plus their PDFs in a single commit, and four subagent streams are live in this checkout. A 600-file rewrite during parallel dispatch is a §11.4.84 collision waiting to happen. This is scoped for a dedicated pass on a quiescent tree.</w:t>
+      </w:r>
+    </w:p>
     <w:bookmarkEnd w:id="173"/>
+    <w:bookmarkStart w:id="174" w:name="Xdd0ee01778cdd0beedeedde5af68edc2fd92d6b"/>
+    <w:p>
+      <w:pPr>
+        <w:pStyle w:val="Heading2"/>
+      </w:pPr>
+      <w:r>
+        <w:t xml:space="preserve">BOB-182 — Operator decision owed on the export-charset ratchet, plus an auto-lowering baseline</w:t>
+      </w:r>
+    </w:p>
+    <w:p>
+      <w:pPr>
+        <w:pStyle w:val="FirstParagraph"/>
+      </w:pPr>
+      <w:r>
+        <w:rPr>
+          <w:b/>
+          <w:bCs/>
+        </w:rPr>
+        <w:t xml:space="preserve">Status:</w:t>
+      </w:r>
+      <w:r>
+        <w:t xml:space="preserve"> </w:t>
+      </w:r>
+      <w:r>
+        <w:t xml:space="preserve">Fixed (→ Fixed.md)</w:t>
+      </w:r>
+      <w:r>
+        <w:t xml:space="preserve"> </w:t>
+      </w:r>
+      <w:r>
+        <w:rPr>
+          <w:b/>
+          <w:bCs/>
+        </w:rPr>
+        <w:t xml:space="preserve">Type:</w:t>
+      </w:r>
+      <w:r>
+        <w:t xml:space="preserve"> </w:t>
+      </w:r>
+      <w:r>
+        <w:t xml:space="preserve">Task</w:t>
+      </w:r>
+      <w:r>
+        <w:t xml:space="preserve"> </w:t>
+      </w:r>
+      <w:r>
+        <w:rPr>
+          <w:b/>
+          <w:bCs/>
+        </w:rPr>
+        <w:t xml:space="preserve">Evidence:</w:t>
+      </w:r>
+      <w:r>
+        <w:t xml:space="preserve"> </w:t>
+      </w:r>
+      <w:r>
+        <w:t xml:space="preserve">docs/qa/BOB-182/closure_evidence_20260923.md</w:t>
+      </w:r>
+      <w:r>
+        <w:t xml:space="preserve"> </w:t>
+      </w:r>
+      <w:r>
+        <w:rPr>
+          <w:b/>
+          <w:bCs/>
+        </w:rPr>
+        <w:t xml:space="preserve">Severity:</w:t>
+      </w:r>
+      <w:r>
+        <w:t xml:space="preserve"> </w:t>
+      </w:r>
+      <w:r>
+        <w:t xml:space="preserve">Medium</w:t>
+      </w:r>
+      <w:r>
+        <w:t xml:space="preserve"> </w:t>
+      </w:r>
+      <w:r>
+        <w:rPr>
+          <w:b/>
+          <w:bCs/>
+        </w:rPr>
+        <w:t xml:space="preserve">Created-By:</w:t>
+      </w:r>
+      <w:r>
+        <w:t xml:space="preserve"> </w:t>
+      </w:r>
+      <w:r>
+        <w:t xml:space="preserve">Claude</w:t>
+      </w:r>
+      <w:r>
+        <w:t xml:space="preserve"> </w:t>
+      </w:r>
+      <w:r>
+        <w:rPr>
+          <w:b/>
+          <w:bCs/>
+        </w:rPr>
+        <w:t xml:space="preserve">Assigned-To:</w:t>
+      </w:r>
+      <w:r>
+        <w:t xml:space="preserve"> </w:t>
+      </w:r>
+      <w:r>
+        <w:t xml:space="preserve">Claude</w:t>
+      </w:r>
+    </w:p>
+    <w:p>
+      <w:pPr>
+        <w:pStyle w:val="BodyText"/>
+      </w:pPr>
+      <w:r>
+        <w:rPr>
+          <w:b/>
+          <w:bCs/>
+        </w:rPr>
+        <w:t xml:space="preserve">OPERATOR DECISION (2026-08-26, §11.4.66 interactive clarification): KEEP THE MONOTONE RATCHET</w:t>
+      </w:r>
+    </w:p>
+    <w:p>
+      <w:pPr>
+        <w:pStyle w:val="BodyText"/>
+      </w:pPr>
+      <w:r>
+        <w:t xml:space="preserve">§11.4.224(E) brownfield adoption answer, recorded as consumer DATA: the adoption model for CM-EXPORT-CHARSET-VALID is the MONOTONE-DECREASE RATCHET. The count may only go down, never up. Immediate hard floor, changed-code-only-with-deadline, and per-corpus phase-in were all offered and NOT chosen. This closes half of BOB-182 — the half that was genuinely the operator’s. THE REMAINING HALF IS A REAL DEFECT STILL OWED: BASELINE is a hardcoded constant, so the ratchet does not actually ratchet — on improvement the gate PASSES and PRINTS the value to lower it to, but nothing lowers it, and the gate keeps permitting regression back to the original count after the corpus heals. The fix must NOT collapse §11.4.249 role separation: a gate that writes its own threshold during a pre-build run becomes a PRODUCER as well as a GATE. Acceptable shapes include a persisted baseline the gate READS but never writes with lowering via a separate explicitly-invoked command, or a gate that FAILS loudly when the live count is below baseline so drift becomes an actionable refusal.</w:t>
+      </w:r>
+    </w:p>
+    <w:p>
+      <w:pPr>
+        <w:pStyle w:val="BodyText"/>
+      </w:pPr>
+      <w:r>
+        <w:t xml:space="preserve">This answer is recorded as consumer DATA per §11.4.35 — it is the operator’s stated choice, not an agent inference, and supersedes any prior agent-chosen default on this question. Options not chosen are named above so a future reader does not re-litigate a settled call (§11.4.112(5) bounded-verdict discipline applied to decisions).</w:t>
+      </w:r>
+    </w:p>
+    <w:p>
+      <w:pPr>
+        <w:pStyle w:val="BodyText"/>
+      </w:pPr>
+      <w:r>
+        <w:t xml:space="preserve">— prior item text follows —</w:t>
+      </w:r>
+    </w:p>
+    <w:p>
+      <w:pPr>
+        <w:pStyle w:val="BodyText"/>
+      </w:pPr>
+      <w:r>
+        <w:t xml:space="preserve">WHAT: CM-EXPORT-CHARSET-VALID (pre-build invariant 50) adopts its 301 pre-existing violations via a monotone-decrease ratchet rather than a hard floor. Two things are owed.</w:t>
+      </w:r>
+    </w:p>
+    <w:p>
+      <w:pPr>
+        <w:numPr>
+          <w:ilvl w:val="0"/>
+          <w:numId w:val="1006"/>
+        </w:numPr>
+      </w:pPr>
+      <w:r>
+        <w:t xml:space="preserve">THE ADOPTION DECISION IS THE OPERATOR’S, NOT THE SCRIPT’S. 11.4.224(E) requires the brownfield adoption question be SURFACED to the operator and the answer recorded as consumer DATA – never an invented ratchet. What exists today is a header comment plus a BOBA_EXPORT_CHARSET_BASELINE override: that DOCUMENTS a decision the agent made, it does not RECORD an answer the operator gave. The independent reviewer judged the choice defensible and would not reverse it (a hard floor on 301 violations makes the build unreachable, which 11.4.234 forbids; 11.4.101 favours the reversible option) but correctly held that it is not yet compliant. Options for the operator: immediate hard floor (BASELINE=0) / keep the monotone ratchet / per-corpus phase-in / changed-code-only with a scheduled full-corpus deadline.</w:t>
+      </w:r>
+    </w:p>
+    <w:p>
+      <w:pPr>
+        <w:numPr>
+          <w:ilvl w:val="0"/>
+          <w:numId w:val="1006"/>
+        </w:numPr>
+      </w:pPr>
+      <w:r>
+        <w:t xml:space="preserve">THE RATCHET DOES NOT ACTUALLY RATCHET. BASELINE is a hardcoded constant. On improvement the gate PASSES and PRINTS the value to lower it to, but nothing lowers it, so the gate keeps permitting regression all the way back to 301 after the corpus heals. The header now says tightening is MANUAL rather than claiming automatic behaviour that does not exist (11.4.6), but the honest statement is a stopgap, not the fix.</w:t>
+      </w:r>
+    </w:p>
+    <w:p>
+      <w:pPr>
+        <w:pStyle w:val="FirstParagraph"/>
+      </w:pPr>
+      <w:r>
+        <w:t xml:space="preserve">WHY IT WAS NOT BUILT WITH THE FIX: a gate that writes its own threshold during a pre-build run becomes a PRODUCER as well as a GATE (11.4.249 role separation), and that is a design change the operator should approve rather than receive as a side effect.</w:t>
+      </w:r>
+    </w:p>
+    <w:p>
+      <w:pPr>
+        <w:pStyle w:val="BodyText"/>
+      </w:pPr>
+      <w:r>
+        <w:t xml:space="preserve">ACCEPTANCE: the operator’s adoption answer recorded as consumer DATA; and either a persisted baseline the gate lowers and never raises (with the role-separation question answered), or an explicit decision that manual tightening is acceptable.</w:t>
+      </w:r>
+    </w:p>
+    <w:bookmarkEnd w:id="174"/>
+    <w:bookmarkStart w:id="175" w:name="X2457d6f4246fec47602999e0cab6230885ba48b"/>
+    <w:p>
+      <w:pPr>
+        <w:pStyle w:val="Heading2"/>
+      </w:pPr>
+      <w:r>
+        <w:t xml:space="preserve">BOB-195 — CM-DANGEROUS-COMBINATION-FAIL-CLOSED cannot see contextlib.suppress, and ruff SIM105 pushes authors into that blind spot</w:t>
+      </w:r>
+    </w:p>
+    <w:p>
+      <w:pPr>
+        <w:pStyle w:val="FirstParagraph"/>
+      </w:pPr>
+      <w:r>
+        <w:rPr>
+          <w:b/>
+          <w:bCs/>
+        </w:rPr>
+        <w:t xml:space="preserve">Status:</w:t>
+      </w:r>
+      <w:r>
+        <w:t xml:space="preserve"> </w:t>
+      </w:r>
+      <w:r>
+        <w:t xml:space="preserve">Fixed (→ Fixed.md)</w:t>
+      </w:r>
+      <w:r>
+        <w:t xml:space="preserve"> </w:t>
+      </w:r>
+      <w:r>
+        <w:rPr>
+          <w:b/>
+          <w:bCs/>
+        </w:rPr>
+        <w:t xml:space="preserve">Type:</w:t>
+      </w:r>
+      <w:r>
+        <w:t xml:space="preserve"> </w:t>
+      </w:r>
+      <w:r>
+        <w:t xml:space="preserve">Bug</w:t>
+      </w:r>
+      <w:r>
+        <w:t xml:space="preserve"> </w:t>
+      </w:r>
+      <w:r>
+        <w:rPr>
+          <w:b/>
+          <w:bCs/>
+        </w:rPr>
+        <w:t xml:space="preserve">Evidence:</w:t>
+      </w:r>
+      <w:r>
+        <w:t xml:space="preserve"> </w:t>
+      </w:r>
+      <w:r>
+        <w:t xml:space="preserve">docs/qa/BOB-195/closure_evidence_20260923.md</w:t>
+      </w:r>
+    </w:p>
+    <w:p>
+      <w:pPr>
+        <w:pStyle w:val="BodyText"/>
+      </w:pPr>
+      <w:r>
+        <w:rPr>
+          <w:b/>
+          <w:bCs/>
+        </w:rPr>
+        <w:t xml:space="preserve">OPERATOR DECISION (2026-08-26, §11.4.66 interactive clarification): TEACH THE SCANNER With NODES — KEEP SIM105</w:t>
+      </w:r>
+    </w:p>
+    <w:p>
+      <w:pPr>
+        <w:pStyle w:val="BodyText"/>
+      </w:pPr>
+      <w:r>
+        <w:t xml:space="preserve">The §11.4.252 fail-open scanner is FIXED to see</w:t>
+      </w:r>
+      <w:r>
+        <w:t xml:space="preserve"> </w:t>
+      </w:r>
+      <w:r>
+        <w:rPr>
+          <w:rStyle w:val="VerbatimChar"/>
+        </w:rPr>
+        <w:t xml:space="preserve">contextlib.suppress</w:t>
+      </w:r>
+      <w:r>
+        <w:t xml:space="preserve">; ruff’s SIM105 rule STAYS ENABLED in pyproject.toml. Disabling SIM105, and the belt-and-braces both-at-once option, were offered and NOT chosen. Rationale carried with the decision: fixing the gate makes SIM105 harmless, whereas disabling SIM105 alone would leave the gate blind to any suppress written by hand, inherited from a dependency’s style, or already present in the tree. REQUIRED BEHAVIOUR:</w:t>
+      </w:r>
+      <w:r>
+        <w:t xml:space="preserve"> </w:t>
+      </w:r>
+      <w:r>
+        <w:rPr>
+          <w:rStyle w:val="VerbatimChar"/>
+        </w:rPr>
+        <w:t xml:space="preserve">with contextlib.suppress(...)</w:t>
+      </w:r>
+      <w:r>
+        <w:t xml:space="preserve"> </w:t>
+      </w:r>
+      <w:r>
+        <w:t xml:space="preserve">and</w:t>
+      </w:r>
+      <w:r>
+        <w:t xml:space="preserve"> </w:t>
+      </w:r>
+      <w:r>
+        <w:rPr>
+          <w:rStyle w:val="VerbatimChar"/>
+        </w:rPr>
+        <w:t xml:space="preserve">with suppress(...)</w:t>
+      </w:r>
+      <w:r>
+        <w:t xml:space="preserve"> </w:t>
+      </w:r>
+      <w:r>
+        <w:t xml:space="preserve">(the</w:t>
+      </w:r>
+      <w:r>
+        <w:t xml:space="preserve"> </w:t>
+      </w:r>
+      <w:r>
+        <w:rPr>
+          <w:rStyle w:val="VerbatimChar"/>
+        </w:rPr>
+        <w:t xml:space="preserve">from contextlib import suppress</w:t>
+      </w:r>
+      <w:r>
+        <w:t xml:space="preserve"> </w:t>
+      </w:r>
+      <w:r>
+        <w:t xml:space="preserve">binding) wrapping a dangerous-combination call are DETECTED with the same severity and message shape as the try/except/pass form; a narrow</w:t>
+      </w:r>
+      <w:r>
+        <w:t xml:space="preserve"> </w:t>
+      </w:r>
+      <w:r>
+        <w:rPr>
+          <w:rStyle w:val="VerbatimChar"/>
+        </w:rPr>
+        <w:t xml:space="preserve">suppress(SpecificError)</w:t>
+      </w:r>
+      <w:r>
+        <w:t xml:space="preserve"> </w:t>
+      </w:r>
+      <w:r>
+        <w:t xml:space="preserve">around a NON-dangerous call must NOT fire, since a false-positive refusal is a §11.4.201(1) FAIL-bluff of equal severity to a missed real one. CONSEQUENCE FOR THE NUMBER: once landed, the scanner’s finding count stops being a floor over try/except shapes and becomes a genuine census — any prior count citing completeness was scoped to try/except only.</w:t>
+      </w:r>
+    </w:p>
+    <w:p>
+      <w:pPr>
+        <w:pStyle w:val="BodyText"/>
+      </w:pPr>
+      <w:r>
+        <w:t xml:space="preserve">This answer is recorded as consumer DATA per §11.4.35 — it is the operator’s stated choice, not an agent inference, and supersedes any prior agent-chosen default on this question. Options not chosen are named above so a future reader does not re-litigate a settled call (§11.4.112(5) bounded-verdict discipline applied to decisions).</w:t>
+      </w:r>
+    </w:p>
+    <w:p>
+      <w:pPr>
+        <w:pStyle w:val="BodyText"/>
+      </w:pPr>
+      <w:r>
+        <w:t xml:space="preserve">— prior item text follows —</w:t>
+      </w:r>
+    </w:p>
+    <w:p>
+      <w:pPr>
+        <w:pStyle w:val="BodyText"/>
+      </w:pPr>
+      <w:r>
+        <w:t xml:space="preserve">WHAT: the §11.4.252 fail-open scanner matches Try-handler shapes (A1)/(A2). contextlib.suppress is a With node, so a swallow written that way is invisible. VERIFIED BY THE CONDUCTOR with a control needle through the same invocation path (§11.4.201(7)(b)), because a first attempt returned 0 for BOTH forms and was itself blind - the gate takes –root, not a positional, so a bare path exits on an unknown arg (§11.4.201(7)(c): the invocation path is part of the instrument). Correct run: try/except/pass around os.unlink(user_supplied_path) -&gt;</w:t>
+      </w:r>
+      <w:r>
+        <w:t xml:space="preserve"> </w:t>
+      </w:r>
+      <w:r>
+        <w:t xml:space="preserve">‘FAIL - swallowed exception … :5’</w:t>
+      </w:r>
+      <w:r>
+        <w:t xml:space="preserve">, the needle sees. contextlib.suppress(Exception) around the IDENTICAL call -&gt;</w:t>
+      </w:r>
+      <w:r>
+        <w:t xml:space="preserve"> </w:t>
+      </w:r>
+      <w:r>
+        <w:t xml:space="preserve">‘PASS - no swallowed-exception … anti-patterns found’</w:t>
+      </w:r>
+      <w:r>
+        <w:t xml:space="preserve">. Both combine untrusted input with an irreversible unlink; both swallow everything; one is caught and one is not. WHY IT IS WORSE THAN A PLAIN GAP: pyproject.toml enables ruff’s SIM ruleset, and SIM105 is</w:t>
+      </w:r>
+      <w:r>
+        <w:t xml:space="preserve"> </w:t>
+      </w:r>
+      <w:r>
+        <w:t xml:space="preserve">‘use contextlib.suppress instead of try-except-pass’</w:t>
+      </w:r>
+      <w:r>
+        <w:t xml:space="preserve">. Our own linter therefore instructs authors to rewrite the form this gate CAN see into the form it CANNOT. The two tools are pulling in opposite directions and the lint one runs more often. Every SIM105 autofix silently shrinks this gate’s coverage while the count goes down, which reads as progress. CONSEQUENCE FOR THE NUMBER: the scanner’s finding count is a FLOOR over try/except shapes, not a census of swallows. Any statement of the form</w:t>
+      </w:r>
+      <w:r>
+        <w:t xml:space="preserve"> </w:t>
+      </w:r>
+      <w:r>
+        <w:t xml:space="preserve">‘N fail-open sites remain’</w:t>
+      </w:r>
+      <w:r>
+        <w:t xml:space="preserve"> </w:t>
+      </w:r>
+      <w:r>
+        <w:t xml:space="preserve">must be read as</w:t>
+      </w:r>
+      <w:r>
+        <w:t xml:space="preserve"> </w:t>
+      </w:r>
+      <w:r>
+        <w:t xml:space="preserve">‘N among try/except shapes’</w:t>
+      </w:r>
+      <w:r>
+        <w:t xml:space="preserve">. ACCEPTANCE: the scanner recognises contextlib.suppress (a With whose items call contextlib.suppress with a broad exception type) and applies the same ≥2-capability test; a golden-TRUE fixture in suppress form; a golden-FALSE fixture where suppress wraps a single-capability diagnostic emitter and must NOT fire; and an explicit decision on the SIM105 tension - either exempt the shapes this gate governs, or accept suppress and teach the gate to read it. Discovered by the §11.4.252 remediation agent when its own MINOR-3 fix required using contextlib.suppress at three diagnostic-emitter sites; those three uses are legitimate and justified in-source.</w:t>
+      </w:r>
+    </w:p>
+    <w:bookmarkEnd w:id="175"/>
+    <w:bookmarkStart w:id="176" w:name="Xbc70a382de15d7419ef4d7a2ec87fadcb6d4ea0"/>
+    <w:p>
+      <w:pPr>
+        <w:pStyle w:val="Heading2"/>
+      </w:pPr>
+      <w:r>
+        <w:t xml:space="preserve">BOB-150 — pre_build_verification.sh invariant labels read N/50 but only 41 invariants are labelled</w:t>
+      </w:r>
+    </w:p>
+    <w:p>
+      <w:pPr>
+        <w:pStyle w:val="FirstParagraph"/>
+      </w:pPr>
+      <w:r>
+        <w:rPr>
+          <w:b/>
+          <w:bCs/>
+        </w:rPr>
+        <w:t xml:space="preserve">Status:</w:t>
+      </w:r>
+      <w:r>
+        <w:t xml:space="preserve"> </w:t>
+      </w:r>
+      <w:r>
+        <w:t xml:space="preserve">Fixed (→ Fixed.md)</w:t>
+      </w:r>
+      <w:r>
+        <w:t xml:space="preserve"> </w:t>
+      </w:r>
+      <w:r>
+        <w:rPr>
+          <w:b/>
+          <w:bCs/>
+        </w:rPr>
+        <w:t xml:space="preserve">Type:</w:t>
+      </w:r>
+      <w:r>
+        <w:t xml:space="preserve"> </w:t>
+      </w:r>
+      <w:r>
+        <w:t xml:space="preserve">Task</w:t>
+      </w:r>
+      <w:r>
+        <w:t xml:space="preserve"> </w:t>
+      </w:r>
+      <w:r>
+        <w:rPr>
+          <w:b/>
+          <w:bCs/>
+        </w:rPr>
+        <w:t xml:space="preserve">Evidence:</w:t>
+      </w:r>
+      <w:r>
+        <w:t xml:space="preserve"> </w:t>
+      </w:r>
+      <w:r>
+        <w:t xml:space="preserve">docs/qa/BOB-150/closure_evidence_20260923.md</w:t>
+      </w:r>
+      <w:r>
+        <w:t xml:space="preserve"> </w:t>
+      </w:r>
+      <w:r>
+        <w:rPr>
+          <w:b/>
+          <w:bCs/>
+        </w:rPr>
+        <w:t xml:space="preserve">Severity:</w:t>
+      </w:r>
+      <w:r>
+        <w:t xml:space="preserve"> </w:t>
+      </w:r>
+      <w:r>
+        <w:t xml:space="preserve">Low</w:t>
+      </w:r>
+      <w:r>
+        <w:t xml:space="preserve"> </w:t>
+      </w:r>
+      <w:r>
+        <w:rPr>
+          <w:b/>
+          <w:bCs/>
+        </w:rPr>
+        <w:t xml:space="preserve">Created-By:</w:t>
+      </w:r>
+      <w:r>
+        <w:t xml:space="preserve"> </w:t>
+      </w:r>
+      <w:r>
+        <w:t xml:space="preserve">AI</w:t>
+      </w:r>
+    </w:p>
+    <w:p>
+      <w:pPr>
+        <w:pStyle w:val="BodyText"/>
+      </w:pPr>
+      <w:r>
+        <w:t xml:space="preserve">pre_build_verification.sh invariant labels read N/44 but only 35 invariants are labelled</w:t>
+      </w:r>
+    </w:p>
+    <w:bookmarkEnd w:id="176"/>
+    <w:bookmarkStart w:id="177" w:name="X017ecc07d3925d281ee41edb70c49dccdf9f346"/>
+    <w:p>
+      <w:pPr>
+        <w:pStyle w:val="Heading2"/>
+      </w:pPr>
+      <w:r>
+        <w:t xml:space="preserve">BOB-168 — run_all_challenges.sh lists scaling_horizontal_challenge.sh which does not exist on disk, so the runner references a challenge that can never execute</w:t>
+      </w:r>
+    </w:p>
+    <w:p>
+      <w:pPr>
+        <w:pStyle w:val="FirstParagraph"/>
+      </w:pPr>
+      <w:r>
+        <w:rPr>
+          <w:b/>
+          <w:bCs/>
+        </w:rPr>
+        <w:t xml:space="preserve">Status:</w:t>
+      </w:r>
+      <w:r>
+        <w:t xml:space="preserve"> </w:t>
+      </w:r>
+      <w:r>
+        <w:t xml:space="preserve">Fixed (→ Fixed.md)</w:t>
+      </w:r>
+      <w:r>
+        <w:t xml:space="preserve"> </w:t>
+      </w:r>
+      <w:r>
+        <w:rPr>
+          <w:b/>
+          <w:bCs/>
+        </w:rPr>
+        <w:t xml:space="preserve">Type:</w:t>
+      </w:r>
+      <w:r>
+        <w:t xml:space="preserve"> </w:t>
+      </w:r>
+      <w:r>
+        <w:t xml:space="preserve">Task</w:t>
+      </w:r>
+      <w:r>
+        <w:t xml:space="preserve"> </w:t>
+      </w:r>
+      <w:r>
+        <w:rPr>
+          <w:b/>
+          <w:bCs/>
+        </w:rPr>
+        <w:t xml:space="preserve">Evidence:</w:t>
+      </w:r>
+      <w:r>
+        <w:t xml:space="preserve"> </w:t>
+      </w:r>
+      <w:r>
+        <w:t xml:space="preserve">docs/qa/BOB-168/closure_evidence_20260923.md</w:t>
+      </w:r>
+      <w:r>
+        <w:t xml:space="preserve"> </w:t>
+      </w:r>
+      <w:r>
+        <w:rPr>
+          <w:b/>
+          <w:bCs/>
+        </w:rPr>
+        <w:t xml:space="preserve">Severity:</w:t>
+      </w:r>
+      <w:r>
+        <w:t xml:space="preserve"> </w:t>
+      </w:r>
+      <w:r>
+        <w:t xml:space="preserve">Low</w:t>
+      </w:r>
+      <w:r>
+        <w:t xml:space="preserve"> </w:t>
+      </w:r>
+      <w:r>
+        <w:rPr>
+          <w:b/>
+          <w:bCs/>
+        </w:rPr>
+        <w:t xml:space="preserve">Created-By:</w:t>
+      </w:r>
+      <w:r>
+        <w:t xml:space="preserve"> </w:t>
+      </w:r>
+      <w:r>
+        <w:t xml:space="preserve">Claude</w:t>
+      </w:r>
+      <w:r>
+        <w:t xml:space="preserve"> </w:t>
+      </w:r>
+      <w:r>
+        <w:rPr>
+          <w:b/>
+          <w:bCs/>
+        </w:rPr>
+        <w:t xml:space="preserve">Assigned-To:</w:t>
+      </w:r>
+      <w:r>
+        <w:t xml:space="preserve"> </w:t>
+      </w:r>
+      <w:r>
+        <w:t xml:space="preserve">Claude</w:t>
+      </w:r>
+    </w:p>
+    <w:p>
+      <w:pPr>
+        <w:pStyle w:val="BodyText"/>
+      </w:pPr>
+      <w:r>
+        <w:t xml:space="preserve">WHAT. scripts/run_all_challenges.sh:66 lists</w:t>
+      </w:r>
+      <w:r>
+        <w:t xml:space="preserve"> </w:t>
+      </w:r>
+      <w:r>
+        <w:t xml:space="preserve">“scaling_horizontal_challenge.sh”</w:t>
+      </w:r>
+      <w:r>
+        <w:t xml:space="preserve"> </w:t>
+      </w:r>
+      <w:r>
+        <w:t xml:space="preserve">in its challenge set. challenges/scripts/scaling_horizontal_challenge.sh does not exist:</w:t>
+      </w:r>
+    </w:p>
+    <w:p>
+      <w:pPr>
+        <w:pStyle w:val="SourceCode"/>
+      </w:pPr>
+      <w:r>
+        <w:rPr>
+          <w:rStyle w:val="VerbatimChar"/>
+        </w:rPr>
+        <w:t xml:space="preserve">$ sed -n '66p' scripts/run_all_challenges.sh</w:t>
+      </w:r>
+      <w:r>
+        <w:br/>
+      </w:r>
+      <w:r>
+        <w:rPr>
+          <w:rStyle w:val="VerbatimChar"/>
+        </w:rPr>
+        <w:t xml:space="preserve">    "scaling_horizontal_challenge.sh"</w:t>
+      </w:r>
+      <w:r>
+        <w:br/>
+      </w:r>
+      <w:r>
+        <w:rPr>
+          <w:rStyle w:val="VerbatimChar"/>
+        </w:rPr>
+        <w:t xml:space="preserve">$ ls challenges/scripts/scaling_horizontal_challenge.sh</w:t>
+      </w:r>
+      <w:r>
+        <w:br/>
+      </w:r>
+      <w:r>
+        <w:rPr>
+          <w:rStyle w:val="VerbatimChar"/>
+        </w:rPr>
+        <w:t xml:space="preserve">  ls: cannot access ...: No such file or directory</w:t>
+      </w:r>
+    </w:p>
+    <w:p>
+      <w:pPr>
+        <w:pStyle w:val="FirstParagraph"/>
+      </w:pPr>
+      <w:r>
+        <w:t xml:space="preserve">VERIFIED independently, not taken on report — surfaced by the BOB-109 scaling agent and re-checked here by direct invocation.</w:t>
+      </w:r>
+    </w:p>
+    <w:p>
+      <w:pPr>
+        <w:pStyle w:val="BodyText"/>
+      </w:pPr>
+      <w:r>
+        <w:t xml:space="preserve">WHY IT MATTERS. Whether this is cosmetic or a §11.4.201 gate-honesty defect depends entirely on how the runner treats a missing entry, and that is the first thing to determine: if it SKIPs silently, the challenge bank advertises coverage it does not have (a §11.4.266 claim-vs-reality row with no passing challenge behind it); if it FAILs, the runner is permanently red for a reason unrelated to the system under test, which trains readers to ignore it. Neither outcome is acceptable; they need different fixes.</w:t>
+      </w:r>
+    </w:p>
+    <w:p>
+      <w:pPr>
+        <w:pStyle w:val="BodyText"/>
+      </w:pPr>
+      <w:r>
+        <w:t xml:space="preserve">ACCEPTANCE. (a) Determine and record the runner’s actual behaviour on the missing entry by invoking it, not by reading it. (b) EITHER author the challenge, OR remove the entry — with §11.4.124 discipline: check git history for whether it once existed and was deleted, since a silently-dropped challenge is the more interesting defect. (c) If the runner silently skips missing entries, that is its own finding: a missing challenge must be loud (§11.4.3 SKIP-with-reason at minimum), never absent-and-quiet.</w:t>
+      </w:r>
+    </w:p>
+    <w:p>
+      <w:pPr>
+        <w:pStyle w:val="BodyText"/>
+      </w:pPr>
+      <w:r>
+        <w:t xml:space="preserve">SEVERITY. Low as a defect, but it sits on the challenge-coverage seam, so (c) may deserve its own item.</w:t>
+      </w:r>
+    </w:p>
+    <w:p>
+      <w:pPr>
+        <w:pStyle w:val="BodyText"/>
+      </w:pPr>
+      <w:r>
+        <w:t xml:space="preserve">CORRECTION 2026-08-22 (§11.4.6) — THIS ITEM’S PREMISE WAS FALSE, and the error was mine. Recorded openly rather than quietly edited.</w:t>
+      </w:r>
+    </w:p>
+    <w:p>
+      <w:pPr>
+        <w:pStyle w:val="BodyText"/>
+      </w:pPr>
+      <w:r>
+        <w:t xml:space="preserve">scaling_horizontal_challenge.sh EXISTS. It is at submodules/challenges/challenges/scripts/scaling_horizontal_challenge.sh, executable, 3107 bytes, dated Aug 7. So do all 14 other entries and the meta-runner. It was never deleted: added to the roster at 1c959ba, the challenge itself added in the submodule at 873c0b1, and a pickaxe search across both repositories and all branches finds ZERO deletions.</w:t>
+      </w:r>
+    </w:p>
+    <w:p>
+      <w:pPr>
+        <w:pStyle w:val="BodyText"/>
+      </w:pPr>
+      <w:r>
+        <w:t xml:space="preserve">HOW I GOT IT WRONG. run_all_challenges.sh reads submodules/challenges/challenges/scripts/. I checked challenges/scripts/ — a DIFFERENT directory belonging to a DIFFERENT, glob-based runner. Two similarly-named directories; I measured the wrong one. That is a §11.4.201(9) field-identity error. Worse, I wrote that it was</w:t>
+      </w:r>
+      <w:r>
+        <w:t xml:space="preserve"> </w:t>
+      </w:r>
+      <w:r>
+        <w:t xml:space="preserve">“verified by invocation”</w:t>
+      </w:r>
+      <w:r>
+        <w:t xml:space="preserve">: I had listed a directory and never run the aggregator, so the claim overstated the evidence class as well as getting the answer wrong.</w:t>
+      </w:r>
+    </w:p>
+    <w:p>
+      <w:pPr>
+        <w:pStyle w:val="BodyText"/>
+      </w:pPr>
+      <w:r>
+        <w:t xml:space="preserve">THE LESSON, which generalises past this item. In the SAME commit I correctly caught a sibling agent making this exact class of error on BOB-167 — a zero-hit produced by searching one symbol name — and applied a control needle there. Then I omitted the needle one paragraph later on my own measurement. The distinction that would have caught it: A CONTROL NEEDLE PROVES THE INSTRUMENT CAN SEE; IT DOES NOT PROVE IT IS POINTED AT THE THING UNDER TEST. §11.4.201(7)(b) as commonly applied guards blindness; it does not guard mis-aiming. The needle for THIS query would have been to resolve the path the runner itself reads, not to confirm that some directory listing works.</w:t>
+      </w:r>
+    </w:p>
+    <w:p>
+      <w:pPr>
+        <w:pStyle w:val="BodyText"/>
+      </w:pPr>
+      <w:r>
+        <w:t xml:space="preserve">WHAT IS ACTUALLY WRONG, and it is worse than what I filed. The missing-entry path runs no challenges by definition, so it can be exercised safely. Run against a checkout where the submodule is absent — the ordinary state of a clone made without –recursive — the REAL runner (byte-identity sha-asserted, not a replica) reports:</w:t>
+      </w:r>
+    </w:p>
+    <w:p>
+      <w:pPr>
+        <w:pStyle w:val="SourceCode"/>
+      </w:pPr>
+      <w:r>
+        <w:rPr>
+          <w:rStyle w:val="VerbatimChar"/>
+        </w:rPr>
+        <w:t xml:space="preserve">PASS: 0   FAIL: 0   SKIP: 16   TOTAL: 16</w:t>
+      </w:r>
+      <w:r>
+        <w:br/>
+      </w:r>
+      <w:r>
+        <w:rPr>
+          <w:rStyle w:val="VerbatimChar"/>
+        </w:rPr>
+        <w:t xml:space="preserve">OBSERVED EXIT CODE: 0</w:t>
+      </w:r>
+    </w:p>
+    <w:p>
+      <w:pPr>
+        <w:pStyle w:val="FirstParagraph"/>
+      </w:pPr>
+      <w:r>
+        <w:t xml:space="preserve">An ENTIRELY UN-RUN BANK REPORTS SUCCESS. Not one dangling entry tolerated — the whole suite silently passes without executing anything. That is §11.4.201(6) false-null verbatim, and it is observed-reachable rather than constructed (§11.4.115(G)).</w:t>
+      </w:r>
+    </w:p>
+    <w:p>
+      <w:pPr>
+        <w:pStyle w:val="BodyText"/>
+      </w:pPr>
+      <w:r>
+        <w:t xml:space="preserve">REVISED ACCEPTANCE. (a) ANSWERED, though not as filed: the runner reports a loud, counted SKIP and then never blocks, because the exit expression reads only the FAIL count. (b) The dangling-entry half is VOID — nothing is dangling. (c) The real work is the exit contract: a roster entry the runner cannot execute must not be indistinguishable from a healthy run. See the decision recorded in docs/qa/BOB-168/decision_missing_vs_skip.md.</w:t>
+      </w:r>
+    </w:p>
+    <w:p>
+      <w:pPr>
+        <w:pStyle w:val="BodyText"/>
+      </w:pPr>
+      <w:r>
+        <w:t xml:space="preserve">RELATED, REPORTED NOT FIXED: scripts/pre_build_verification.sh:1792 carries the same SKIP/MISSING conflation one level up, for the other runner. Filed separately.</w:t>
+      </w:r>
+    </w:p>
+    <w:bookmarkEnd w:id="177"/>
+    <w:bookmarkStart w:id="178" w:name="Xc1496edb6ca961c63b0ec89302ef65e71839717"/>
+    <w:p>
+      <w:pPr>
+        <w:pStyle w:val="Heading2"/>
+      </w:pPr>
+      <w:r>
+        <w:t xml:space="preserve">BOB-154 — Host venv and production container run different starlette versions (1.4.1 vs 1.6.0)</w:t>
+      </w:r>
+    </w:p>
+    <w:p>
+      <w:pPr>
+        <w:pStyle w:val="FirstParagraph"/>
+      </w:pPr>
+      <w:r>
+        <w:rPr>
+          <w:b/>
+          <w:bCs/>
+        </w:rPr>
+        <w:t xml:space="preserve">Status:</w:t>
+      </w:r>
+      <w:r>
+        <w:t xml:space="preserve"> </w:t>
+      </w:r>
+      <w:r>
+        <w:t xml:space="preserve">Fixed (→ Fixed.md)</w:t>
+      </w:r>
+      <w:r>
+        <w:t xml:space="preserve"> </w:t>
+      </w:r>
+      <w:r>
+        <w:rPr>
+          <w:b/>
+          <w:bCs/>
+        </w:rPr>
+        <w:t xml:space="preserve">Type:</w:t>
+      </w:r>
+      <w:r>
+        <w:t xml:space="preserve"> </w:t>
+      </w:r>
+      <w:r>
+        <w:t xml:space="preserve">Bug</w:t>
+      </w:r>
+      <w:r>
+        <w:t xml:space="preserve"> </w:t>
+      </w:r>
+      <w:r>
+        <w:rPr>
+          <w:b/>
+          <w:bCs/>
+        </w:rPr>
+        <w:t xml:space="preserve">Evidence:</w:t>
+      </w:r>
+      <w:r>
+        <w:t xml:space="preserve"> </w:t>
+      </w:r>
+      <w:r>
+        <w:t xml:space="preserve">docs/qa/BOB-154/closure_evidence_20260923.md</w:t>
+      </w:r>
+      <w:r>
+        <w:t xml:space="preserve"> </w:t>
+      </w:r>
+      <w:r>
+        <w:rPr>
+          <w:b/>
+          <w:bCs/>
+        </w:rPr>
+        <w:t xml:space="preserve">Severity:</w:t>
+      </w:r>
+      <w:r>
+        <w:t xml:space="preserve"> </w:t>
+      </w:r>
+      <w:r>
+        <w:t xml:space="preserve">Medium</w:t>
+      </w:r>
+      <w:r>
+        <w:t xml:space="preserve"> </w:t>
+      </w:r>
+      <w:r>
+        <w:rPr>
+          <w:b/>
+          <w:bCs/>
+        </w:rPr>
+        <w:t xml:space="preserve">Created-By:</w:t>
+      </w:r>
+      <w:r>
+        <w:t xml:space="preserve"> </w:t>
+      </w:r>
+      <w:r>
+        <w:t xml:space="preserve">AI</w:t>
+      </w:r>
+    </w:p>
+    <w:p>
+      <w:pPr>
+        <w:pStyle w:val="BodyText"/>
+      </w:pPr>
+      <w:r>
+        <w:t xml:space="preserve">Host venv and production container run different starlette versions (1.4.1 vs 1.6.0)</w:t>
+      </w:r>
+    </w:p>
+    <w:bookmarkEnd w:id="178"/>
+    <w:bookmarkStart w:id="179" w:name="X06cd7e6960292c84b4e50a29b892446587b19eb"/>
+    <w:p>
+      <w:pPr>
+        <w:pStyle w:val="Heading2"/>
+      </w:pPr>
+      <w:r>
+        <w:t xml:space="preserve">BOB-189 — CM-NO-FAIL-OPEN-SKIP scanner flags fail-CLOSED SSRF guards as fail-open (§11.4.201(1) FAIL-bluff in our own gate)</w:t>
+      </w:r>
+    </w:p>
+    <w:p>
+      <w:pPr>
+        <w:pStyle w:val="FirstParagraph"/>
+      </w:pPr>
+      <w:r>
+        <w:rPr>
+          <w:b/>
+          <w:bCs/>
+        </w:rPr>
+        <w:t xml:space="preserve">Status:</w:t>
+      </w:r>
+      <w:r>
+        <w:t xml:space="preserve"> </w:t>
+      </w:r>
+      <w:r>
+        <w:t xml:space="preserve">Fixed (→ Fixed.md)</w:t>
+      </w:r>
+      <w:r>
+        <w:t xml:space="preserve"> </w:t>
+      </w:r>
+      <w:r>
+        <w:rPr>
+          <w:b/>
+          <w:bCs/>
+        </w:rPr>
+        <w:t xml:space="preserve">Type:</w:t>
+      </w:r>
+      <w:r>
+        <w:t xml:space="preserve"> </w:t>
+      </w:r>
+      <w:r>
+        <w:t xml:space="preserve">Bug</w:t>
+      </w:r>
+      <w:r>
+        <w:t xml:space="preserve"> </w:t>
+      </w:r>
+      <w:r>
+        <w:rPr>
+          <w:b/>
+          <w:bCs/>
+        </w:rPr>
+        <w:t xml:space="preserve">Evidence:</w:t>
+      </w:r>
+      <w:r>
+        <w:t xml:space="preserve"> </w:t>
+      </w:r>
+      <w:r>
+        <w:t xml:space="preserve">docs/qa/BOB-189/closure_evidence_20260923.md</w:t>
+      </w:r>
+    </w:p>
+    <w:p>
+      <w:pPr>
+        <w:pStyle w:val="BodyText"/>
+      </w:pPr>
+      <w:r>
+        <w:t xml:space="preserve">WHAT: the fail-open scanner’s shape-(A2) heuristic cannot distinguish</w:t>
+      </w:r>
+      <w:r>
+        <w:t xml:space="preserve"> </w:t>
+      </w:r>
+      <w:r>
+        <w:t xml:space="preserve">‘return False’</w:t>
+      </w:r>
+      <w:r>
+        <w:t xml:space="preserve"> </w:t>
+      </w:r>
+      <w:r>
+        <w:t xml:space="preserve">meaning PROCEED-AS-IF-FINE from</w:t>
+      </w:r>
+      <w:r>
+        <w:t xml:space="preserve"> </w:t>
+      </w:r>
+      <w:r>
+        <w:t xml:space="preserve">‘return False’</w:t>
+      </w:r>
+      <w:r>
+        <w:t xml:space="preserve"> </w:t>
+      </w:r>
+      <w:r>
+        <w:t xml:space="preserve">meaning REFUSE. It flags six textbook fail-CLOSED guards as fail-open defects: _is_safe_fetch_url (x3), _qbit_add_succeeded (x2), and the hooks path-boundary guard. INDEPENDENTLY VERIFIED 2026-08-25 by the conductor rather than taken on the triage agent’s word: download-proxy/src/api/routes.py:1122 defines _is_safe_fetch_url returning bool, and its only call site at :1476 reads ’if not _is_safe_fetch_url(url): logger.warning(Refusing SSRF-unsafe download URL (non-public target); skipping); continue’ - a False return REFUSES the URL. WHY THIS MATTERS: per §11.4.201(1) a false-positive refusal is a FAIL-bluff of equal severity to a false-negative pass, and here the consequence is worse than noise - acting on the finding would mean making the SSRF guard stop returning False, i.e. deleting an SSRF protection to satisfy a gate. A gate that instructs you to remove a security control is actively dangerous, not merely imprecise. REPRO: run the fail-open scan; observe six hits; read each call site. ACCEPTANCE: the scanner distinguishes refuse-shaped from proceed-shaped False returns (call-site-aware, or an audited waiver list with per-entry justification), the six drop out, AND a golden-FALSE fixture containing a real fail-closed guard is added so the discrimination is itself falsifiable per §1.1.</w:t>
+      </w:r>
+    </w:p>
+    <w:bookmarkEnd w:id="179"/>
+    <w:bookmarkStart w:id="180" w:name="Xbfda80761c63f79ac26bddd895b0b093114764e"/>
+    <w:p>
+      <w:pPr>
+        <w:pStyle w:val="Heading2"/>
+      </w:pPr>
+      <w:r>
+        <w:t xml:space="preserve">BOB-152 — Constitution sweep walks vendored third-party code: 82% of one gate’s 38,291 findings come from submodules/</w:t>
+      </w:r>
+    </w:p>
+    <w:p>
+      <w:pPr>
+        <w:pStyle w:val="FirstParagraph"/>
+      </w:pPr>
+      <w:r>
+        <w:rPr>
+          <w:b/>
+          <w:bCs/>
+        </w:rPr>
+        <w:t xml:space="preserve">Status:</w:t>
+      </w:r>
+      <w:r>
+        <w:t xml:space="preserve"> </w:t>
+      </w:r>
+      <w:r>
+        <w:t xml:space="preserve">Fixed (→ Fixed.md)</w:t>
+      </w:r>
+      <w:r>
+        <w:t xml:space="preserve"> </w:t>
+      </w:r>
+      <w:r>
+        <w:rPr>
+          <w:b/>
+          <w:bCs/>
+        </w:rPr>
+        <w:t xml:space="preserve">Type:</w:t>
+      </w:r>
+      <w:r>
+        <w:t xml:space="preserve"> </w:t>
+      </w:r>
+      <w:r>
+        <w:t xml:space="preserve">Bug</w:t>
+      </w:r>
+      <w:r>
+        <w:t xml:space="preserve"> </w:t>
+      </w:r>
+      <w:r>
+        <w:rPr>
+          <w:b/>
+          <w:bCs/>
+        </w:rPr>
+        <w:t xml:space="preserve">Evidence:</w:t>
+      </w:r>
+      <w:r>
+        <w:t xml:space="preserve"> </w:t>
+      </w:r>
+      <w:r>
+        <w:t xml:space="preserve">docs/qa/BOB-152/closure_evidence_20260923.md</w:t>
+      </w:r>
+      <w:r>
+        <w:t xml:space="preserve"> </w:t>
+      </w:r>
+      <w:r>
+        <w:rPr>
+          <w:b/>
+          <w:bCs/>
+        </w:rPr>
+        <w:t xml:space="preserve">Severity:</w:t>
+      </w:r>
+      <w:r>
+        <w:t xml:space="preserve"> </w:t>
+      </w:r>
+      <w:r>
+        <w:t xml:space="preserve">Medium</w:t>
+      </w:r>
+      <w:r>
+        <w:t xml:space="preserve"> </w:t>
+      </w:r>
+      <w:r>
+        <w:rPr>
+          <w:b/>
+          <w:bCs/>
+        </w:rPr>
+        <w:t xml:space="preserve">Created-By:</w:t>
+      </w:r>
+      <w:r>
+        <w:t xml:space="preserve"> </w:t>
+      </w:r>
+      <w:r>
+        <w:t xml:space="preserve">AI</w:t>
+      </w:r>
+    </w:p>
+    <w:p>
+      <w:pPr>
+        <w:pStyle w:val="BodyText"/>
+      </w:pPr>
+      <w:r>
+        <w:t xml:space="preserve">Constitution sweep walks vendored third-party code: 82% of one gate’s 38,291 findings come from submodules/</w:t>
+      </w:r>
+    </w:p>
+    <w:bookmarkEnd w:id="180"/>
+    <w:bookmarkStart w:id="181" w:name="Xa95d999866c3515d160d35e6f532f5b7227ec86"/>
+    <w:p>
+      <w:pPr>
+        <w:pStyle w:val="Heading2"/>
+      </w:pPr>
+      <w:r>
+        <w:t xml:space="preserve">BOB-197 — Auth is env-gated and OFF by default, so the LAN-bound merge service ships open — needs a boot-time invariant, not a static gate</w:t>
+      </w:r>
+    </w:p>
+    <w:p>
+      <w:pPr>
+        <w:pStyle w:val="FirstParagraph"/>
+      </w:pPr>
+      <w:r>
+        <w:rPr>
+          <w:b/>
+          <w:bCs/>
+        </w:rPr>
+        <w:t xml:space="preserve">Status:</w:t>
+      </w:r>
+      <w:r>
+        <w:t xml:space="preserve"> </w:t>
+      </w:r>
+      <w:r>
+        <w:t xml:space="preserve">Fixed (→ Fixed.md)</w:t>
+      </w:r>
+      <w:r>
+        <w:t xml:space="preserve"> </w:t>
+      </w:r>
+      <w:r>
+        <w:rPr>
+          <w:b/>
+          <w:bCs/>
+        </w:rPr>
+        <w:t xml:space="preserve">Type:</w:t>
+      </w:r>
+      <w:r>
+        <w:t xml:space="preserve"> </w:t>
+      </w:r>
+      <w:r>
+        <w:t xml:space="preserve">Bug</w:t>
+      </w:r>
+      <w:r>
+        <w:t xml:space="preserve"> </w:t>
+      </w:r>
+      <w:r>
+        <w:rPr>
+          <w:b/>
+          <w:bCs/>
+        </w:rPr>
+        <w:t xml:space="preserve">Evidence:</w:t>
+      </w:r>
+      <w:r>
+        <w:t xml:space="preserve"> </w:t>
+      </w:r>
+      <w:r>
+        <w:t xml:space="preserve">docs/qa/BOB-197/closure_evidence_20260923.md</w:t>
+      </w:r>
+      <w:r>
+        <w:t xml:space="preserve"> </w:t>
+      </w:r>
+      <w:r>
+        <w:rPr>
+          <w:b/>
+          <w:bCs/>
+        </w:rPr>
+        <w:t xml:space="preserve">Created-By:</w:t>
+      </w:r>
+      <w:r>
+        <w:t xml:space="preserve"> </w:t>
+      </w:r>
+      <w:r>
+        <w:t xml:space="preserve">Claude</w:t>
+      </w:r>
+      <w:r>
+        <w:t xml:space="preserve"> </w:t>
+      </w:r>
+      <w:r>
+        <w:rPr>
+          <w:b/>
+          <w:bCs/>
+        </w:rPr>
+        <w:t xml:space="preserve">Assigned-To:</w:t>
+      </w:r>
+      <w:r>
+        <w:t xml:space="preserve"> </w:t>
+      </w:r>
+      <w:r>
+        <w:t xml:space="preserve">milos85vasic</w:t>
+      </w:r>
+    </w:p>
+    <w:p>
+      <w:pPr>
+        <w:pStyle w:val="BodyText"/>
+      </w:pPr>
+      <w:r>
+        <w:rPr>
+          <w:b/>
+          <w:bCs/>
+        </w:rPr>
+        <w:t xml:space="preserve">OPERATOR DECISION (2026-08-26, §11.4.66): GENERATE THE TOKEN AND ARM IT</w:t>
+      </w:r>
+    </w:p>
+    <w:p>
+      <w:pPr>
+        <w:pStyle w:val="BodyText"/>
+      </w:pPr>
+      <w:r>
+        <w:t xml:space="preserve">The conductor generates a 32-byte random token and writes BOBA_API_TOKEN into .env; the operator configures clients with it. DONE 2026-08-26: token generated via secrets.token_hex(32), appended to .env with a comment naming BOB-197 and the routes.py:83 env-gating fact, chmod 600, value shown to the operator ONCE and never written to any other file. Safety verified BEFORE writing (§11.4.30/§11.4.10): .env matched .gitignore:27 ’*.env’ and was untracked (needle-proven — the same matcher confirmed docker-compose.yml IS tracked, so the negative is real); a §9.2 pre-op backup was taken and is itself ignored; post-write re-check confirmed .env still ignored and absent from git status. Pre-store audit found the only tracked BOBA_API_TOKEN= occurrences are the docker-compose passthrough ${BOBA_API_TOKEN:-} and prose in the leak-audit challenge — no literal value has ever been committed. STILL OWED, and the item stays open until it lands: the BOOT-TIME INVARIANT (§11.4.254) that refuses to start LAN-bound when the token is unset or empty. Without it the arming is a state fix, not a defect fix — §11.4.226(5) is explicit that a state-only repair cannot close a defect item. Options not chosen: operator sets it themselves with the invariant blocking until then; invariant warns first and blocks on a named date.</w:t>
+      </w:r>
+    </w:p>
+    <w:p>
+      <w:pPr>
+        <w:pStyle w:val="BodyText"/>
+      </w:pPr>
+      <w:r>
+        <w:t xml:space="preserve">Recorded as consumer DATA per §11.4.35 — the operator’s stated choice, not an agent inference. Options not chosen are named so a future reader does not re-litigate a settled call.</w:t>
+      </w:r>
+    </w:p>
+    <w:p>
+      <w:pPr>
+        <w:pStyle w:val="BodyText"/>
+      </w:pPr>
+      <w:r>
+        <w:t xml:space="preserve">— prior item text follows —</w:t>
+      </w:r>
+    </w:p>
+    <w:p>
+      <w:pPr>
+        <w:pStyle w:val="BodyText"/>
+      </w:pPr>
+      <w:r>
+        <w:t xml:space="preserve">OPERATOR DECISION (2026-08-26): arm BOBA_API_TOKEN and keep 0.0.0.0, backed by a BOOT-TIME invariant that refuses to start LAN-bound with the token unset. This item IS that invariant.</w:t>
+      </w:r>
+    </w:p>
+    <w:p>
+      <w:pPr>
+        <w:pStyle w:val="BodyText"/>
+      </w:pPr>
+      <w:r>
+        <w:t xml:space="preserve">MEASURED FACT, not inference. download-proxy/src/api/routes.py:83 require_api_token() reads BOBA_API_TOKEN at request time and returns immediately when unset or empty. Its own docstring states it plainly:</w:t>
+      </w:r>
+      <w:r>
+        <w:t xml:space="preserve"> </w:t>
+      </w:r>
+      <w:r>
+        <w:t xml:space="preserve">“BOBA_API_TOKEN unset/empty -&gt; return (OPEN). This is the DEFAULT and preserves the current no-auth contract + dev workflow”</w:t>
+      </w:r>
+      <w:r>
+        <w:t xml:space="preserve">. docker-compose.yml:237 passes BOBA_API_TOKEN=${BOBA_API_TOKEN:-}, so the container inherits empty unless the operator declares it. The operator .env does NOT declare it, needle-verified per 11.4.201(7)(b): the same matcher hit QBITTORRENT_DATA_DIR in the same file, so the miss is a real absence and not a blind read. The qbittorrent-proxy container was RUNNING and LAN-bound at measurement time. Consequence: the ten routes the BOB-102 guard resolves as auth-wired are open in practice on a default deploy.</w:t>
+      </w:r>
+    </w:p>
+    <w:p>
+      <w:pPr>
+        <w:pStyle w:val="BodyText"/>
+      </w:pPr>
+      <w:r>
+        <w:t xml:space="preserve">WHY A STATIC GATE CANNOT COVER THIS. The BOB-102 gate asserts static route WIRING - that a Depends(require_api_token) marker exists on handler, decorator or router. It cannot assert runtime ARMING, which depends on an env var read per request. Claiming the static gate covers it would be exactly the bluff the gate exists to prevent (11.4.262: machine evidence must match the layer it claims). This is a boot-time invariant class per 11.4.254.</w:t>
+      </w:r>
+    </w:p>
+    <w:p>
+      <w:pPr>
+        <w:pStyle w:val="BodyText"/>
+      </w:pPr>
+      <w:r>
+        <w:t xml:space="preserve">ACCEPTANCE: a boot-time check that, when the listener is LAN-bound (not loopback), refuses to start with a non-zero exit and a named cause if BOBA_API_TOKEN is unset or empty, so the open state becomes UNREACHABLE rather than the default. Paired 1.1 mutation: remove the check, prove the service starts LAN-bound-and-open. Golden-FALSE per 11.4.201(1): a loopback-bound listener with the token unset must NOT be refused, or the check becomes a false-positive refusal blocking legitimate dev work.</w:t>
+      </w:r>
+    </w:p>
+    <w:p>
+      <w:pPr>
+        <w:pStyle w:val="BodyText"/>
+      </w:pPr>
+      <w:r>
+        <w:t xml:space="preserve">11.4.238 COVERAGE-ESCAPE NOTE: found by a subagent reading source during BOB-102 guard construction, NOT by the automated QA regime - which is itself the defect class 11.4.238 names. The boot-time check IS the new automated check that would have caught it.</w:t>
+      </w:r>
+    </w:p>
+    <w:bookmarkEnd w:id="181"/>
+    <w:bookmarkStart w:id="182" w:name="X0ef5171860534825a6301902a107819f9a34377"/>
+    <w:p>
+      <w:pPr>
+        <w:pStyle w:val="Heading2"/>
+      </w:pPr>
+      <w:r>
+        <w:t xml:space="preserve">BOB-141 — CLAUDE.md claims the Go profile serves 7186/7187/7188 but its container binds only 7187 — doc contradicts the Dockerfile</w:t>
+      </w:r>
+    </w:p>
+    <w:p>
+      <w:pPr>
+        <w:pStyle w:val="FirstParagraph"/>
+      </w:pPr>
+      <w:r>
+        <w:rPr>
+          <w:b/>
+          <w:bCs/>
+        </w:rPr>
+        <w:t xml:space="preserve">Status:</w:t>
+      </w:r>
+      <w:r>
+        <w:t xml:space="preserve"> </w:t>
+      </w:r>
+      <w:r>
+        <w:t xml:space="preserve">Fixed (→ Fixed.md)</w:t>
+      </w:r>
+      <w:r>
+        <w:t xml:space="preserve"> </w:t>
+      </w:r>
+      <w:r>
+        <w:rPr>
+          <w:b/>
+          <w:bCs/>
+        </w:rPr>
+        <w:t xml:space="preserve">Type:</w:t>
+      </w:r>
+      <w:r>
+        <w:t xml:space="preserve"> </w:t>
+      </w:r>
+      <w:r>
+        <w:t xml:space="preserve">Task</w:t>
+      </w:r>
+      <w:r>
+        <w:t xml:space="preserve"> </w:t>
+      </w:r>
+      <w:r>
+        <w:rPr>
+          <w:b/>
+          <w:bCs/>
+        </w:rPr>
+        <w:t xml:space="preserve">Evidence:</w:t>
+      </w:r>
+      <w:r>
+        <w:t xml:space="preserve"> </w:t>
+      </w:r>
+      <w:r>
+        <w:t xml:space="preserve">docs/qa/BOB-141/closure_evidence_20260923.md</w:t>
+      </w:r>
+      <w:r>
+        <w:t xml:space="preserve"> </w:t>
+      </w:r>
+      <w:r>
+        <w:rPr>
+          <w:b/>
+          <w:bCs/>
+        </w:rPr>
+        <w:t xml:space="preserve">Severity:</w:t>
+      </w:r>
+      <w:r>
+        <w:t xml:space="preserve"> </w:t>
+      </w:r>
+      <w:r>
+        <w:t xml:space="preserve">Low</w:t>
+      </w:r>
+      <w:r>
+        <w:t xml:space="preserve"> </w:t>
+      </w:r>
+      <w:r>
+        <w:rPr>
+          <w:b/>
+          <w:bCs/>
+        </w:rPr>
+        <w:t xml:space="preserve">Created-By:</w:t>
+      </w:r>
+      <w:r>
+        <w:t xml:space="preserve"> </w:t>
+      </w:r>
+      <w:r>
+        <w:t xml:space="preserve">Claude</w:t>
+      </w:r>
+    </w:p>
+    <w:p>
+      <w:pPr>
+        <w:pStyle w:val="BodyText"/>
+      </w:pPr>
+      <w:r>
+        <w:t xml:space="preserve">CLAUDE.md claims the Go profile serves 7186/7187/7188 but its container binds only 7187 — doc contradicts the Dockerfile</w:t>
+      </w:r>
+    </w:p>
+    <w:bookmarkEnd w:id="182"/>
+    <w:bookmarkStart w:id="183" w:name="X9991bb9773dc58c94842edea440f362a03d117e"/>
+    <w:p>
+      <w:pPr>
+        <w:pStyle w:val="Heading2"/>
+      </w:pPr>
+      <w:r>
+        <w:t xml:space="preserve">BOB-228 — README does not link the LAN-route auth gate guide, so a §11.4.65-scope doc is an orphan under §11.4.212</w:t>
+      </w:r>
+    </w:p>
+    <w:p>
+      <w:pPr>
+        <w:pStyle w:val="FirstParagraph"/>
+      </w:pPr>
+      <w:r>
+        <w:rPr>
+          <w:b/>
+          <w:bCs/>
+        </w:rPr>
+        <w:t xml:space="preserve">Status:</w:t>
+      </w:r>
+      <w:r>
+        <w:t xml:space="preserve"> </w:t>
+      </w:r>
+      <w:r>
+        <w:t xml:space="preserve">Fixed (→ Fixed.md)</w:t>
+      </w:r>
+      <w:r>
+        <w:t xml:space="preserve"> </w:t>
+      </w:r>
+      <w:r>
+        <w:rPr>
+          <w:b/>
+          <w:bCs/>
+        </w:rPr>
+        <w:t xml:space="preserve">Type:</w:t>
+      </w:r>
+      <w:r>
+        <w:t xml:space="preserve"> </w:t>
+      </w:r>
+      <w:r>
+        <w:t xml:space="preserve">Task</w:t>
+      </w:r>
+      <w:r>
+        <w:t xml:space="preserve"> </w:t>
+      </w:r>
+      <w:r>
+        <w:rPr>
+          <w:b/>
+          <w:bCs/>
+        </w:rPr>
+        <w:t xml:space="preserve">Evidence:</w:t>
+      </w:r>
+      <w:r>
+        <w:t xml:space="preserve"> </w:t>
+      </w:r>
+      <w:r>
+        <w:t xml:space="preserve">docs/qa/BOB-228/closure_evidence_20260923.md</w:t>
+      </w:r>
+      <w:r>
+        <w:t xml:space="preserve"> </w:t>
+      </w:r>
+      <w:r>
+        <w:rPr>
+          <w:b/>
+          <w:bCs/>
+        </w:rPr>
+        <w:t xml:space="preserve">Severity:</w:t>
+      </w:r>
+      <w:r>
+        <w:t xml:space="preserve"> </w:t>
+      </w:r>
+      <w:r>
+        <w:t xml:space="preserve">minor</w:t>
+      </w:r>
+      <w:r>
+        <w:t xml:space="preserve"> </w:t>
+      </w:r>
+      <w:r>
+        <w:rPr>
+          <w:b/>
+          <w:bCs/>
+        </w:rPr>
+        <w:t xml:space="preserve">Created-By:</w:t>
+      </w:r>
+      <w:r>
+        <w:t xml:space="preserve"> </w:t>
+      </w:r>
+      <w:r>
+        <w:t xml:space="preserve">Claude</w:t>
+      </w:r>
+      <w:r>
+        <w:t xml:space="preserve"> </w:t>
+      </w:r>
+      <w:r>
+        <w:rPr>
+          <w:b/>
+          <w:bCs/>
+        </w:rPr>
+        <w:t xml:space="preserve">Assigned-To:</w:t>
+      </w:r>
+      <w:r>
+        <w:t xml:space="preserve"> </w:t>
+      </w:r>
+      <w:r>
+        <w:t xml:space="preserve">Claude</w:t>
+      </w:r>
+    </w:p>
+    <w:p>
+      <w:pPr>
+        <w:pStyle w:val="BodyText"/>
+      </w:pPr>
+      <w:r>
+        <w:t xml:space="preserve">WHAT: §11.4.212 makes the main README the canonical entry point for ALL project documentation, with no §11.4.65-scope doc reachable by no link path. docs/scripts/check_cm_lan_routes_authenticated.md is not reachable from README.md. MEASURED 2026-08-27: grep -c for the guide name in README.md returns 0, control-needled against a doc README does link (CONTINUATION returns 1), so the instrument is not blind. ACCEPTANCE: README links the guide directly or transitively, and the doc-link generator covers docs/scripts/ so the next such guide cannot land orphaned. Surfaced by the BOB-102 round-13 remediation and independently verified 2026-08-27.</w:t>
+      </w:r>
+    </w:p>
+    <w:bookmarkEnd w:id="183"/>
+    <w:bookmarkEnd w:id="184"/>
     <w:sectPr>
       <w:footnotePr>
         <w:numRestart w:val="eachSect"/>
@@ -32480,6 +34467,36 @@
   </w:num>
   <w:num w:numId="1005">
     <w:abstractNumId w:val="99731"/>
+    <w:lvlOverride w:ilvl="0">
+      <w:startOverride w:val="1"/>
+    </w:lvlOverride>
+    <w:lvlOverride w:ilvl="1">
+      <w:startOverride w:val="1"/>
+    </w:lvlOverride>
+    <w:lvlOverride w:ilvl="2">
+      <w:startOverride w:val="1"/>
+    </w:lvlOverride>
+    <w:lvlOverride w:ilvl="3">
+      <w:startOverride w:val="1"/>
+    </w:lvlOverride>
+    <w:lvlOverride w:ilvl="4">
+      <w:startOverride w:val="1"/>
+    </w:lvlOverride>
+    <w:lvlOverride w:ilvl="5">
+      <w:startOverride w:val="1"/>
+    </w:lvlOverride>
+    <w:lvlOverride w:ilvl="6">
+      <w:startOverride w:val="1"/>
+    </w:lvlOverride>
+    <w:lvlOverride w:ilvl="7">
+      <w:startOverride w:val="1"/>
+    </w:lvlOverride>
+    <w:lvlOverride w:ilvl="8">
+      <w:startOverride w:val="1"/>
+    </w:lvlOverride>
+  </w:num>
+  <w:num w:numId="1006">
+    <w:abstractNumId w:val="99431"/>
     <w:lvlOverride w:ilvl="0">
       <w:startOverride w:val="1"/>
     </w:lvlOverride>

</xml_diff>

<commit_message>
docs(qa,db): close BOB-137/161/164/232 with live evidence; file BOB-233 (reload-jackett false success)
Stack reinstalled from HEAD 69b049a: units current, boba.target enabled, linger yes, full recreate onto fresh images, all four containers healthy, ports 7185-7189/9117 answering.
BOB-137: live soak - real search 1444 results, 222 health probes, max 60ms, 0 over 1s.
BOB-164: live axe scan 3 passed against the running dashboard.
BOB-233: start.sh --reload-jackett reported recreated while the container kept the old image.

Co-Authored-By: Claude Sonnet 5 <noreply@anthropic.com>
</commit_message>
<xml_diff>
--- a/docs/Fixed.docx
+++ b/docs/Fixed.docx
@@ -2,7 +2,7 @@
 <file path=word/document.xml><?xml version="1.0" encoding="utf-8"?>
 <w:document xmlns:w="http://schemas.openxmlformats.org/wordprocessingml/2006/main" xmlns:m="http://schemas.openxmlformats.org/officeDocument/2006/math" xmlns:r="http://schemas.openxmlformats.org/officeDocument/2006/relationships" xmlns:o="urn:schemas-microsoft-com:office:office" xmlns:v="urn:schemas-microsoft-com:vml" xmlns:w10="urn:schemas-microsoft-com:office:word" xmlns:a="http://schemas.openxmlformats.org/drawingml/2006/main" xmlns:pic="http://schemas.openxmlformats.org/drawingml/2006/picture" xmlns:wp="http://schemas.openxmlformats.org/drawingml/2006/wordprocessingDrawing">
   <w:body>
-    <w:bookmarkStart w:id="186" w:name="fixed-closed-workable-items"/>
+    <w:bookmarkStart w:id="188" w:name="fixed-closed-workable-items"/>
     <w:p>
       <w:pPr>
         <w:pStyle w:val="Heading1"/>
@@ -26,7 +26,7 @@
         <w:t xml:space="preserve"> </w:t>
       </w:r>
       <w:r>
-        <w:t xml:space="preserve">52</w:t>
+        <w:t xml:space="preserve">53</w:t>
       </w:r>
       <w:r>
         <w:t xml:space="preserve"> </w:t>
@@ -42,7 +42,7 @@
         <w:t xml:space="preserve"> </w:t>
       </w:r>
       <w:r>
-        <w:t xml:space="preserve">2026-09-23T16:19:50Z</w:t>
+        <w:t xml:space="preserve">2026-09-23T16:57:54Z</w:t>
       </w:r>
       <w:r>
         <w:t xml:space="preserve"> </w:t>
@@ -34280,7 +34280,361 @@
       </w:r>
     </w:p>
     <w:bookmarkEnd w:id="185"/>
+    <w:bookmarkStart w:id="186" w:name="Xb0d761205fc9acb1ed5a32aa130bed16f0f5bc6"/>
+    <w:p>
+      <w:pPr>
+        <w:pStyle w:val="Heading2"/>
+      </w:pPr>
+      <w:r>
+        <w:t xml:space="preserve">BOB-137 — Merge service on 7187 wedges while the same process still serves 7186 (GIL starvation by one spinning thread)</w:t>
+      </w:r>
+    </w:p>
+    <w:p>
+      <w:pPr>
+        <w:pStyle w:val="FirstParagraph"/>
+      </w:pPr>
+      <w:r>
+        <w:rPr>
+          <w:b/>
+          <w:bCs/>
+        </w:rPr>
+        <w:t xml:space="preserve">Status:</w:t>
+      </w:r>
+      <w:r>
+        <w:t xml:space="preserve"> </w:t>
+      </w:r>
+      <w:r>
+        <w:t xml:space="preserve">Fixed (→ Fixed.md)</w:t>
+      </w:r>
+      <w:r>
+        <w:t xml:space="preserve"> </w:t>
+      </w:r>
+      <w:r>
+        <w:rPr>
+          <w:b/>
+          <w:bCs/>
+        </w:rPr>
+        <w:t xml:space="preserve">Type:</w:t>
+      </w:r>
+      <w:r>
+        <w:t xml:space="preserve"> </w:t>
+      </w:r>
+      <w:r>
+        <w:t xml:space="preserve">Bug</w:t>
+      </w:r>
+      <w:r>
+        <w:t xml:space="preserve"> </w:t>
+      </w:r>
+      <w:r>
+        <w:rPr>
+          <w:b/>
+          <w:bCs/>
+        </w:rPr>
+        <w:t xml:space="preserve">Evidence:</w:t>
+      </w:r>
+      <w:r>
+        <w:t xml:space="preserve"> </w:t>
+      </w:r>
+      <w:r>
+        <w:t xml:space="preserve">docs/qa/BOB-137/closure_evidence_20260923.md</w:t>
+      </w:r>
+      <w:r>
+        <w:t xml:space="preserve"> </w:t>
+      </w:r>
+      <w:r>
+        <w:rPr>
+          <w:b/>
+          <w:bCs/>
+        </w:rPr>
+        <w:t xml:space="preserve">Severity:</w:t>
+      </w:r>
+      <w:r>
+        <w:t xml:space="preserve"> </w:t>
+      </w:r>
+      <w:r>
+        <w:t xml:space="preserve">High</w:t>
+      </w:r>
+      <w:r>
+        <w:t xml:space="preserve"> </w:t>
+      </w:r>
+      <w:r>
+        <w:rPr>
+          <w:b/>
+          <w:bCs/>
+        </w:rPr>
+        <w:t xml:space="preserve">Created-By:</w:t>
+      </w:r>
+      <w:r>
+        <w:t xml:space="preserve"> </w:t>
+      </w:r>
+      <w:r>
+        <w:t xml:space="preserve">Claude</w:t>
+      </w:r>
+    </w:p>
+    <w:p>
+      <w:pPr>
+        <w:pStyle w:val="BodyText"/>
+      </w:pPr>
+      <w:r>
+        <w:t xml:space="preserve">Merge service on 7187 wedges while the same process still serves 7186 (GIL starvation by one spinning thread)</w:t>
+      </w:r>
+    </w:p>
     <w:bookmarkEnd w:id="186"/>
+    <w:bookmarkStart w:id="187" w:name="X11db4a28fa64161c7ffe87a7b2e88f2f3a45339"/>
+    <w:p>
+      <w:pPr>
+        <w:pStyle w:val="Heading2"/>
+      </w:pPr>
+      <w:r>
+        <w:t xml:space="preserve">BOB-164 — Live dashboard fails WCAG AA colour contrast on 21 nodes — brand heading measures 1.43:1 against a 3:1 floor</w:t>
+      </w:r>
+    </w:p>
+    <w:p>
+      <w:pPr>
+        <w:pStyle w:val="FirstParagraph"/>
+      </w:pPr>
+      <w:r>
+        <w:rPr>
+          <w:b/>
+          <w:bCs/>
+        </w:rPr>
+        <w:t xml:space="preserve">Status:</w:t>
+      </w:r>
+      <w:r>
+        <w:t xml:space="preserve"> </w:t>
+      </w:r>
+      <w:r>
+        <w:t xml:space="preserve">Fixed (→ Fixed.md)</w:t>
+      </w:r>
+      <w:r>
+        <w:t xml:space="preserve"> </w:t>
+      </w:r>
+      <w:r>
+        <w:rPr>
+          <w:b/>
+          <w:bCs/>
+        </w:rPr>
+        <w:t xml:space="preserve">Type:</w:t>
+      </w:r>
+      <w:r>
+        <w:t xml:space="preserve"> </w:t>
+      </w:r>
+      <w:r>
+        <w:t xml:space="preserve">Bug</w:t>
+      </w:r>
+      <w:r>
+        <w:t xml:space="preserve"> </w:t>
+      </w:r>
+      <w:r>
+        <w:rPr>
+          <w:b/>
+          <w:bCs/>
+        </w:rPr>
+        <w:t xml:space="preserve">Evidence:</w:t>
+      </w:r>
+      <w:r>
+        <w:t xml:space="preserve"> </w:t>
+      </w:r>
+      <w:r>
+        <w:t xml:space="preserve">docs/qa/BOB-164/closure_evidence_20260923.md</w:t>
+      </w:r>
+      <w:r>
+        <w:t xml:space="preserve"> </w:t>
+      </w:r>
+      <w:r>
+        <w:rPr>
+          <w:b/>
+          <w:bCs/>
+        </w:rPr>
+        <w:t xml:space="preserve">Severity:</w:t>
+      </w:r>
+      <w:r>
+        <w:t xml:space="preserve"> </w:t>
+      </w:r>
+      <w:r>
+        <w:t xml:space="preserve">Medium</w:t>
+      </w:r>
+      <w:r>
+        <w:t xml:space="preserve"> </w:t>
+      </w:r>
+      <w:r>
+        <w:rPr>
+          <w:b/>
+          <w:bCs/>
+        </w:rPr>
+        <w:t xml:space="preserve">Created-By:</w:t>
+      </w:r>
+      <w:r>
+        <w:t xml:space="preserve"> </w:t>
+      </w:r>
+      <w:r>
+        <w:t xml:space="preserve">BOB-110 UX-class coverage, discovered by the new axe-core suite on its first live run</w:t>
+      </w:r>
+    </w:p>
+    <w:p>
+      <w:pPr>
+        <w:pStyle w:val="BodyText"/>
+      </w:pPr>
+      <w:r>
+        <w:rPr>
+          <w:b/>
+          <w:bCs/>
+        </w:rPr>
+        <w:t xml:space="preserve">Reported-Via:</w:t>
+      </w:r>
+      <w:r>
+        <w:t xml:space="preserve"> </w:t>
+      </w:r>
+      <w:r>
+        <w:t xml:space="preserve">§11.4.202 reporting directive</w:t>
+      </w:r>
+      <w:r>
+        <w:t xml:space="preserve"> </w:t>
+      </w:r>
+      <w:r>
+        <w:rPr>
+          <w:rStyle w:val="VerbatimChar"/>
+        </w:rPr>
+        <w:t xml:space="preserve">bug</w:t>
+      </w:r>
+      <w:r>
+        <w:t xml:space="preserve"> </w:t>
+      </w:r>
+      <w:r>
+        <w:t xml:space="preserve">on 2026-08-21T19:56:53Z</w:t>
+      </w:r>
+      <w:r>
+        <w:t xml:space="preserve"> </w:t>
+      </w:r>
+      <w:r>
+        <w:rPr>
+          <w:b/>
+          <w:bCs/>
+        </w:rPr>
+        <w:t xml:space="preserve">Reported-By:</w:t>
+      </w:r>
+      <w:r>
+        <w:t xml:space="preserve"> </w:t>
+      </w:r>
+      <w:r>
+        <w:t xml:space="preserve">BOB-110 UX-class coverage, discovered by the new axe-core suite on its first live run</w:t>
+      </w:r>
+    </w:p>
+    <w:p>
+      <w:pPr>
+        <w:pStyle w:val="BodyText"/>
+      </w:pPr>
+      <w:r>
+        <w:rPr>
+          <w:b/>
+          <w:bCs/>
+        </w:rPr>
+        <w:t xml:space="preserve">What (the report, verbatim):</w:t>
+      </w:r>
+      <w:r>
+        <w:t xml:space="preserve"> </w:t>
+      </w:r>
+      <w:r>
+        <w:t xml:space="preserve">This is a REAL user-facing defect, not a test-tuning artifact, and it was found by the automated regime rather than by a human squinting at the page – which is exactly the 11.4.238 posture the project is aiming for.</w:t>
+      </w:r>
+    </w:p>
+    <w:p>
+      <w:pPr>
+        <w:pStyle w:val="BodyText"/>
+      </w:pPr>
+      <w:r>
+        <w:t xml:space="preserve">The static-grep oracle would NOT have found it. Measured: the served root ships an empty</w:t>
+      </w:r>
+      <w:r>
+        <w:t xml:space="preserve"> </w:t>
+      </w:r>
+      <w:r>
+        <w:t xml:space="preserve"> </w:t>
+      </w:r>
+      <w:r>
+        <w:t xml:space="preserve">pre-hydration, so any check reading the raw HTML audits a page nobody sees. The violation only exists in the hydrated DOM, which is why 11.4.170 requires a rendered oracle and forbids value-equality assertions as the proof a UI is correct.</w:t>
+      </w:r>
+    </w:p>
+    <w:p>
+      <w:pPr>
+        <w:pStyle w:val="BodyText"/>
+      </w:pPr>
+      <w:r>
+        <w:t xml:space="preserve">Severity reasoning, stated rather than assumed: this is user-visible and affects the primary dashboard heading, but it degrades legibility rather than breaking function, and the surface is operator-facing rather than public. Medium, not High.</w:t>
+      </w:r>
+    </w:p>
+    <w:p>
+      <w:pPr>
+        <w:pStyle w:val="BodyText"/>
+      </w:pPr>
+      <w:r>
+        <w:t xml:space="preserve">The failing test was left FAILING on purpose (11.4.238) instead of silenced or marked xfail. tests/ux/ currently reports 1 failed, 16 passed; that 1 is this defect. Anyone reading a red UX suite should read it as this item, not as flakiness – and when this is fixed the suite goes fully green, which is the signal that it is closed.</w:t>
+      </w:r>
+    </w:p>
+    <w:p>
+      <w:pPr>
+        <w:pStyle w:val="BodyText"/>
+      </w:pPr>
+      <w:r>
+        <w:t xml:space="preserve">HONEST SCOPE LIMIT (11.4.6): only the dashboard landing view was scanned. The /jackett/* sub-routes and the ng-serve-hosted :4200 route set were NOT audited – the commands to close both are recorded in docs/testing/ux_accessibility.md. So this item’s 21 nodes are a floor, not a total.</w:t>
+      </w:r>
+    </w:p>
+    <w:p>
+      <w:pPr>
+        <w:pStyle w:val="BodyText"/>
+      </w:pPr>
+      <w:r>
+        <w:rPr>
+          <w:b/>
+          <w:bCs/>
+        </w:rPr>
+        <w:t xml:space="preserve">Affected scope / file-scope manifest:</w:t>
+      </w:r>
+      <w:r>
+        <w:t xml:space="preserve"> </w:t>
+      </w:r>
+      <w:r>
+        <w:t xml:space="preserve">the Angular dashboard served at http://localhost:7187/ (same compiled SPA as frontend/); production component CSS, not test files</w:t>
+      </w:r>
+    </w:p>
+    <w:p>
+      <w:pPr>
+        <w:pStyle w:val="BodyText"/>
+      </w:pPr>
+      <w:r>
+        <w:rPr>
+          <w:b/>
+          <w:bCs/>
+        </w:rPr>
+        <w:t xml:space="preserve">Reproduction / context:</w:t>
+      </w:r>
+      <w:r>
+        <w:t xml:space="preserve"> </w:t>
+      </w:r>
+      <w:r>
+        <w:t xml:space="preserve">Run tests/ux/test_live_dashboard_accessibility.py against the running merge service. axe-core v4.13.0, scanning a real Playwright-rendered JS-hydrated DOM, reports color-contrast violations on 21 nodes. Measured pairs: .brand / h1 text #9d001e on background #3c3f41 = 1.43-1.62:1 (WCAG AA large-text floor is 3:1); tagline #808080 on #3c3f41 = 2.68:1 (body-text floor is 4.5:1).</w:t>
+      </w:r>
+    </w:p>
+    <w:p>
+      <w:pPr>
+        <w:pStyle w:val="BodyText"/>
+      </w:pPr>
+      <w:r>
+        <w:rPr>
+          <w:b/>
+          <w:bCs/>
+        </w:rPr>
+        <w:t xml:space="preserve">Acceptance criteria:</w:t>
+      </w:r>
+      <w:r>
+        <w:t xml:space="preserve"> </w:t>
+      </w:r>
+      <w:r>
+        <w:t xml:space="preserve">axe-core reports ZERO color-contrast violations against the live rendered dashboard, with the fix made in production component CSS rather than by relaxing the assertion or excluding the rule (11.4.120: reconcile to the correct mechanism, never weaken the check). The existing tests/ux/ suite is the guard and already fails today, so the RED is captured – closure requires it flipping GREEN against the live surface, which is runtime-class evidence per 11.4.226.</w:t>
+      </w:r>
+    </w:p>
+    <w:bookmarkEnd w:id="187"/>
+    <w:bookmarkEnd w:id="188"/>
     <w:sectPr>
       <w:footnotePr>
         <w:numRestart w:val="eachSect"/>

</xml_diff>

<commit_message>
fix(start,tests,gates): close BOB-192/233 (+ BOB-093 evidence); file BOB-234/235
BOB-233: start.sh --reload-jackett/--reload-proxy-go now read back the running container image id, force a scoped recreate on mismatch and fail loudly if it still differs; live run confirmed image 38ef117ec563 verified running.
BOB-192: all 10 ratcheted fail-open skips fixed (skip only on genuine unreachable, fail on answered errors); CM-NO-FAIL-OPEN-SKIP baseline is now empty with a control-needled zero; self-test case 9 updated to the end-state.
BOB-093: deployed rutracker.py sha256 equals repo; bounded-regex evidence recorded, item stays open (needs a real large rutracker page).
BOB-234: merge_api integration tests send no API token (401 x10). BOB-235: live kinozal auth failure, cause unknown.

Co-Authored-By: Claude Sonnet 5 <noreply@anthropic.com>
</commit_message>
<xml_diff>
--- a/docs/Fixed.docx
+++ b/docs/Fixed.docx
@@ -2,7 +2,7 @@
 <file path=word/document.xml><?xml version="1.0" encoding="utf-8"?>
 <w:document xmlns:w="http://schemas.openxmlformats.org/wordprocessingml/2006/main" xmlns:m="http://schemas.openxmlformats.org/officeDocument/2006/math" xmlns:r="http://schemas.openxmlformats.org/officeDocument/2006/relationships" xmlns:o="urn:schemas-microsoft-com:office:office" xmlns:v="urn:schemas-microsoft-com:vml" xmlns:w10="urn:schemas-microsoft-com:office:word" xmlns:a="http://schemas.openxmlformats.org/drawingml/2006/main" xmlns:pic="http://schemas.openxmlformats.org/drawingml/2006/picture" xmlns:wp="http://schemas.openxmlformats.org/drawingml/2006/wordprocessingDrawing">
   <w:body>
-    <w:bookmarkStart w:id="188" w:name="fixed-closed-workable-items"/>
+    <w:bookmarkStart w:id="190" w:name="fixed-closed-workable-items"/>
     <w:p>
       <w:pPr>
         <w:pStyle w:val="Heading1"/>
@@ -26,7 +26,7 @@
         <w:t xml:space="preserve"> </w:t>
       </w:r>
       <w:r>
-        <w:t xml:space="preserve">53</w:t>
+        <w:t xml:space="preserve">54</w:t>
       </w:r>
       <w:r>
         <w:t xml:space="preserve"> </w:t>
@@ -42,7 +42,7 @@
         <w:t xml:space="preserve"> </w:t>
       </w:r>
       <w:r>
-        <w:t xml:space="preserve">2026-09-23T16:57:54Z</w:t>
+        <w:t xml:space="preserve">2026-09-23T17:21:36Z</w:t>
       </w:r>
       <w:r>
         <w:t xml:space="preserve"> </w:t>
@@ -34634,7 +34634,231 @@
       </w:r>
     </w:p>
     <w:bookmarkEnd w:id="187"/>
+    <w:bookmarkStart w:id="188" w:name="X1724934e377ce09ab028dadb7bcb5985acc45b9"/>
+    <w:p>
+      <w:pPr>
+        <w:pStyle w:val="Heading2"/>
+      </w:pPr>
+      <w:r>
+        <w:t xml:space="preserve">BOB-233 — start.sh –reload-jackett reports</w:t>
+      </w:r>
+      <w:r>
+        <w:t xml:space="preserve"> </w:t>
+      </w:r>
+      <w:r>
+        <w:t xml:space="preserve">‘recreated — Go source changes are now live’</w:t>
+      </w:r>
+      <w:r>
+        <w:t xml:space="preserve"> </w:t>
+      </w:r>
+      <w:r>
+        <w:t xml:space="preserve">while the running boba-jackett container still uses the OLD image</w:t>
+      </w:r>
+    </w:p>
+    <w:p>
+      <w:pPr>
+        <w:pStyle w:val="FirstParagraph"/>
+      </w:pPr>
+      <w:r>
+        <w:rPr>
+          <w:b/>
+          <w:bCs/>
+        </w:rPr>
+        <w:t xml:space="preserve">Status:</w:t>
+      </w:r>
+      <w:r>
+        <w:t xml:space="preserve"> </w:t>
+      </w:r>
+      <w:r>
+        <w:t xml:space="preserve">Fixed (→ Fixed.md)</w:t>
+      </w:r>
+      <w:r>
+        <w:t xml:space="preserve"> </w:t>
+      </w:r>
+      <w:r>
+        <w:rPr>
+          <w:b/>
+          <w:bCs/>
+        </w:rPr>
+        <w:t xml:space="preserve">Type:</w:t>
+      </w:r>
+      <w:r>
+        <w:t xml:space="preserve"> </w:t>
+      </w:r>
+      <w:r>
+        <w:t xml:space="preserve">Bug</w:t>
+      </w:r>
+      <w:r>
+        <w:t xml:space="preserve"> </w:t>
+      </w:r>
+      <w:r>
+        <w:rPr>
+          <w:b/>
+          <w:bCs/>
+        </w:rPr>
+        <w:t xml:space="preserve">Evidence:</w:t>
+      </w:r>
+      <w:r>
+        <w:t xml:space="preserve"> </w:t>
+      </w:r>
+      <w:r>
+        <w:t xml:space="preserve">docs/qa/BOB-233/closure_evidence_20260923.md</w:t>
+      </w:r>
+      <w:r>
+        <w:t xml:space="preserve"> </w:t>
+      </w:r>
+      <w:r>
+        <w:rPr>
+          <w:b/>
+          <w:bCs/>
+        </w:rPr>
+        <w:t xml:space="preserve">Created-By:</w:t>
+      </w:r>
+      <w:r>
+        <w:t xml:space="preserve"> </w:t>
+      </w:r>
+      <w:r>
+        <w:t xml:space="preserve">Claude</w:t>
+      </w:r>
+    </w:p>
+    <w:p>
+      <w:pPr>
+        <w:pStyle w:val="BodyText"/>
+      </w:pPr>
+      <w:r>
+        <w:t xml:space="preserve">Measured 2026-09-23: ./start.sh –reload-jackett rebuilt image 38ef117ec563 and printed [SUCCESS] boba-jackett recreated, but podman inspect boba-jackett still showed image 2a3173ce1941 started 17:09 (Up 2 hours). podman-compose</w:t>
+      </w:r>
+      <w:r>
+        <w:t xml:space="preserve"> </w:t>
+      </w:r>
+      <w:r>
+        <w:t xml:space="preserve">‘up -d boba-jackett’</w:t>
+      </w:r>
+      <w:r>
+        <w:t xml:space="preserve"> </w:t>
+      </w:r>
+      <w:r>
+        <w:t xml:space="preserve">did not recreate an unchanged-config container. Only ./start.sh –recreate moved the container onto the new image. Violates the §11.4.200 verify-after-write rule: the success message is not proof the intended target holds the intended artifact. Fix: after the recreate, read back the running container image id and compare with the freshly built image id, FAIL loudly on mismatch (or force-recreate the scoped service); apply the same to –reload-proxy-go. Needs RED-first test against a stub compose that does not recreate. Reproduction: build a change, run –reload-jackett, compare</w:t>
+      </w:r>
+      <w:r>
+        <w:t xml:space="preserve"> </w:t>
+      </w:r>
+      <w:r>
+        <w:t xml:space="preserve">‘podman inspect boba-jackett –format {{.Image}}’</w:t>
+      </w:r>
+      <w:r>
+        <w:t xml:space="preserve"> </w:t>
+      </w:r>
+      <w:r>
+        <w:t xml:space="preserve">with</w:t>
+      </w:r>
+      <w:r>
+        <w:t xml:space="preserve"> </w:t>
+      </w:r>
+      <w:r>
+        <w:t xml:space="preserve">‘podman images’</w:t>
+      </w:r>
+      <w:r>
+        <w:t xml:space="preserve"> </w:t>
+      </w:r>
+      <w:r>
+        <w:t xml:space="preserve">id.</w:t>
+      </w:r>
+    </w:p>
     <w:bookmarkEnd w:id="188"/>
+    <w:bookmarkStart w:id="189" w:name="Xcbb65803fa4353036c53c7c47477db14ee6e83b"/>
+    <w:p>
+      <w:pPr>
+        <w:pStyle w:val="Heading2"/>
+      </w:pPr>
+      <w:r>
+        <w:t xml:space="preserve">BOB-192 — Remediate the 6 ratcheted CM-NO-FAIL-OPEN-SKIP findings — each needs a live-stack-verified classify-or-fail rewrite</w:t>
+      </w:r>
+    </w:p>
+    <w:p>
+      <w:pPr>
+        <w:pStyle w:val="FirstParagraph"/>
+      </w:pPr>
+      <w:r>
+        <w:rPr>
+          <w:b/>
+          <w:bCs/>
+        </w:rPr>
+        <w:t xml:space="preserve">Status:</w:t>
+      </w:r>
+      <w:r>
+        <w:t xml:space="preserve"> </w:t>
+      </w:r>
+      <w:r>
+        <w:t xml:space="preserve">Fixed (→ Fixed.md)</w:t>
+      </w:r>
+      <w:r>
+        <w:t xml:space="preserve"> </w:t>
+      </w:r>
+      <w:r>
+        <w:rPr>
+          <w:b/>
+          <w:bCs/>
+        </w:rPr>
+        <w:t xml:space="preserve">Type:</w:t>
+      </w:r>
+      <w:r>
+        <w:t xml:space="preserve"> </w:t>
+      </w:r>
+      <w:r>
+        <w:t xml:space="preserve">Task</w:t>
+      </w:r>
+      <w:r>
+        <w:t xml:space="preserve"> </w:t>
+      </w:r>
+      <w:r>
+        <w:rPr>
+          <w:b/>
+          <w:bCs/>
+        </w:rPr>
+        <w:t xml:space="preserve">Evidence:</w:t>
+      </w:r>
+      <w:r>
+        <w:t xml:space="preserve"> </w:t>
+      </w:r>
+      <w:r>
+        <w:t xml:space="preserve">docs/qa/BOB-192/closure_evidence_20260923.md</w:t>
+      </w:r>
+    </w:p>
+    <w:p>
+      <w:pPr>
+        <w:pStyle w:val="BodyText"/>
+      </w:pPr>
+      <w:r>
+        <w:t xml:space="preserve">WHAT: the BOB-161 gate lands with 6 real fail-open skips RATCHETED rather than fixed. Ratcheting is the constitution’s named brownfield default (§11.4.135/§11.4.224(E)) and this repo’s own precedent, so the choice is correct - but the remediation it defers is real work that must be owned somewhere. WHY THIS ITEM EXISTS: the gate’s own header asserted the 6 were</w:t>
+      </w:r>
+      <w:r>
+        <w:t xml:space="preserve"> </w:t>
+      </w:r>
+      <w:r>
+        <w:t xml:space="preserve">‘TRACKED SEPARATELY (§11.4.197)’</w:t>
+      </w:r>
+      <w:r>
+        <w:t xml:space="preserve"> </w:t>
+      </w:r>
+      <w:r>
+        <w:t xml:space="preserve">while no tracker row existed. The §11.4.209 independent review verified the absence and raised it as IMPORTANT-5, noting that without a row those findings are precisely the parked-unverified debt class §11.4.226(4) names - the population an operator samples and finds broken. A prose claim of being tracked is not tracking. WHAT EACH NEEDS: a skip that fires on evidence the host ANSWERED must either classify the response and FAIL on it, or take a §11.4.69 reason that is honestly derivable from the environment rather than from the response - verified against the live stack, not asserted. Two of the six sit under</w:t>
+      </w:r>
+      <w:r>
+        <w:t xml:space="preserve"> </w:t>
+      </w:r>
+      <w:r>
+        <w:t xml:space="preserve">‘# allow-skip:’</w:t>
+      </w:r>
+      <w:r>
+        <w:t xml:space="preserve"> </w:t>
+      </w:r>
+      <w:r>
+        <w:t xml:space="preserve">markers at tests/unit/test_tracker_auth_live.py:105 and :108, which the reviewer confirmed genuinely are fail-open, so that marker must not be treated as absolution. ACCEPTANCE: all 6 remediated with RED-first evidence per §11.4.115, the gate’s BASELINE ratcheted to 0, and the ratchet’s monotone-decreasing property preserved throughout (§11.4.227(A)). NOTE the reviewer’s MINOR-1: a count-baseline absorbs a one-out-one-in swap, so remediation progress must be checked against the finding SET, not only the count.</w:t>
+      </w:r>
+    </w:p>
+    <w:bookmarkEnd w:id="189"/>
+    <w:bookmarkEnd w:id="190"/>
     <w:sectPr>
       <w:footnotePr>
         <w:numRestart w:val="eachSect"/>

</xml_diff>

<commit_message>
docs(tracker): close the export-rewrite bug with reproducible evidence and file the pre-push hook silent-failure bug [skip-ci]
</commit_message>
<xml_diff>
--- a/docs/Fixed.docx
+++ b/docs/Fixed.docx
@@ -2,7 +2,7 @@
 <file path=word/document.xml><?xml version="1.0" encoding="utf-8"?>
 <w:document xmlns:w="http://schemas.openxmlformats.org/wordprocessingml/2006/main" xmlns:m="http://schemas.openxmlformats.org/officeDocument/2006/math" xmlns:r="http://schemas.openxmlformats.org/officeDocument/2006/relationships" xmlns:o="urn:schemas-microsoft-com:office:office" xmlns:v="urn:schemas-microsoft-com:vml" xmlns:w10="urn:schemas-microsoft-com:office:word" xmlns:a="http://schemas.openxmlformats.org/drawingml/2006/main" xmlns:pic="http://schemas.openxmlformats.org/drawingml/2006/picture" xmlns:wp="http://schemas.openxmlformats.org/drawingml/2006/wordprocessingDrawing">
   <w:body>
-    <w:bookmarkStart w:id="215" w:name="fixed-closed-workable-items"/>
+    <w:bookmarkStart w:id="216" w:name="fixed-closed-workable-items"/>
     <w:p>
       <w:pPr>
         <w:pStyle w:val="Heading1"/>
@@ -26,7 +26,7 @@
         <w:t xml:space="preserve"> </w:t>
       </w:r>
       <w:r>
-        <w:t xml:space="preserve">67</w:t>
+        <w:t xml:space="preserve">68</w:t>
       </w:r>
       <w:r>
         <w:t xml:space="preserve"> </w:t>
@@ -42,7 +42,7 @@
         <w:t xml:space="preserve"> </w:t>
       </w:r>
       <w:r>
-        <w:t xml:space="preserve">2026-09-25T17:12:26Z</w:t>
+        <w:t xml:space="preserve">2026-09-26T15:11:04Z</w:t>
       </w:r>
       <w:r>
         <w:t xml:space="preserve"> </w:t>
@@ -38877,7 +38877,277 @@
       </w:r>
     </w:p>
     <w:bookmarkEnd w:id="214"/>
+    <w:bookmarkStart w:id="215" w:name="X20e4bb8c6f49b0bd77a3e76b8798792025b9044"/>
+    <w:p>
+      <w:pPr>
+        <w:pStyle w:val="Heading2"/>
+      </w:pPr>
+      <w:r>
+        <w:t xml:space="preserve">BOB-249 — CM-BASH-UNIT-TESTS-EXECUTED fails: something rewrites tracked export twins while the bash suite runs</w:t>
+      </w:r>
+    </w:p>
+    <w:p>
+      <w:pPr>
+        <w:pStyle w:val="FirstParagraph"/>
+      </w:pPr>
+      <w:r>
+        <w:rPr>
+          <w:b/>
+          <w:bCs/>
+        </w:rPr>
+        <w:t xml:space="preserve">Status:</w:t>
+      </w:r>
+      <w:r>
+        <w:t xml:space="preserve"> </w:t>
+      </w:r>
+      <w:r>
+        <w:t xml:space="preserve">Fixed (→ Fixed.md)</w:t>
+      </w:r>
+      <w:r>
+        <w:t xml:space="preserve"> </w:t>
+      </w:r>
+      <w:r>
+        <w:rPr>
+          <w:b/>
+          <w:bCs/>
+        </w:rPr>
+        <w:t xml:space="preserve">Type:</w:t>
+      </w:r>
+      <w:r>
+        <w:t xml:space="preserve"> </w:t>
+      </w:r>
+      <w:r>
+        <w:t xml:space="preserve">Bug</w:t>
+      </w:r>
+      <w:r>
+        <w:t xml:space="preserve"> </w:t>
+      </w:r>
+      <w:r>
+        <w:rPr>
+          <w:b/>
+          <w:bCs/>
+        </w:rPr>
+        <w:t xml:space="preserve">Evidence:</w:t>
+      </w:r>
+      <w:r>
+        <w:t xml:space="preserve"> </w:t>
+      </w:r>
+      <w:r>
+        <w:t xml:space="preserve">docs/qa/BOB-249/closure_evidence_20260926.md</w:t>
+      </w:r>
+      <w:r>
+        <w:t xml:space="preserve"> </w:t>
+      </w:r>
+      <w:r>
+        <w:rPr>
+          <w:b/>
+          <w:bCs/>
+        </w:rPr>
+        <w:t xml:space="preserve">Severity:</w:t>
+      </w:r>
+      <w:r>
+        <w:t xml:space="preserve"> </w:t>
+      </w:r>
+      <w:r>
+        <w:t xml:space="preserve">Important</w:t>
+      </w:r>
+      <w:r>
+        <w:t xml:space="preserve"> </w:t>
+      </w:r>
+      <w:r>
+        <w:rPr>
+          <w:b/>
+          <w:bCs/>
+        </w:rPr>
+        <w:t xml:space="preserve">Created-By:</w:t>
+      </w:r>
+      <w:r>
+        <w:t xml:space="preserve"> </w:t>
+      </w:r>
+      <w:r>
+        <w:t xml:space="preserve">AI</w:t>
+      </w:r>
+    </w:p>
+    <w:p>
+      <w:pPr>
+        <w:pStyle w:val="BodyText"/>
+      </w:pPr>
+      <w:r>
+        <w:rPr>
+          <w:b/>
+          <w:bCs/>
+        </w:rPr>
+        <w:t xml:space="preserve">Reported-Via:</w:t>
+      </w:r>
+      <w:r>
+        <w:t xml:space="preserve"> </w:t>
+      </w:r>
+      <w:r>
+        <w:t xml:space="preserve">§11.4.202 reporting directive</w:t>
+      </w:r>
+      <w:r>
+        <w:t xml:space="preserve"> </w:t>
+      </w:r>
+      <w:r>
+        <w:rPr>
+          <w:rStyle w:val="VerbatimChar"/>
+        </w:rPr>
+        <w:t xml:space="preserve">bug</w:t>
+      </w:r>
+      <w:r>
+        <w:t xml:space="preserve"> </w:t>
+      </w:r>
+      <w:r>
+        <w:t xml:space="preserve">on 2026-09-26T12:19:46Z</w:t>
+      </w:r>
+      <w:r>
+        <w:t xml:space="preserve"> </w:t>
+      </w:r>
+      <w:r>
+        <w:rPr>
+          <w:b/>
+          <w:bCs/>
+        </w:rPr>
+        <w:t xml:space="preserve">Reported-By:</w:t>
+      </w:r>
+      <w:r>
+        <w:t xml:space="preserve"> </w:t>
+      </w:r>
+      <w:r>
+        <w:t xml:space="preserve">AI</w:t>
+      </w:r>
+    </w:p>
+    <w:p>
+      <w:pPr>
+        <w:pStyle w:val="BodyText"/>
+      </w:pPr>
+      <w:r>
+        <w:rPr>
+          <w:b/>
+          <w:bCs/>
+        </w:rPr>
+        <w:t xml:space="preserve">What (the report, verbatim):</w:t>
+      </w:r>
+      <w:r>
+        <w:t xml:space="preserve"> </w:t>
+      </w:r>
+      <w:r>
+        <w:t xml:space="preserve">Found while running the deferred long gate after merging feature 003 (zero-shortcomings audit). Pre-existing: reproduced identically at the merge-base, so it is not caused by that feature. It keeps the long gate red independently of the separate gate-ledger debt (BOB-237), so BOBA_SYNC_SKIP_CI=1 cannot be retired until both are fixed.</w:t>
+      </w:r>
+    </w:p>
+    <w:p>
+      <w:pPr>
+        <w:pStyle w:val="BodyText"/>
+      </w:pPr>
+      <w:r>
+        <w:rPr>
+          <w:b/>
+          <w:bCs/>
+        </w:rPr>
+        <w:t xml:space="preserve">Affected scope / file-scope manifest:</w:t>
+      </w:r>
+      <w:r>
+        <w:t xml:space="preserve"> </w:t>
+      </w:r>
+      <w:r>
+        <w:t xml:space="preserve">scripts/pre_build_verification.sh invariant 30 (CM-BASH-UNIT-TESTS-EXECUTED); the writer of docs/Issues.</w:t>
+      </w:r>
+      <w:r>
+        <w:rPr>
+          <w:i/>
+          <w:iCs/>
+        </w:rPr>
+        <w:t xml:space="preserve">, docs/Fixed.</w:t>
+      </w:r>
+      <w:r>
+        <w:t xml:space="preserve">, docs/*_Summary.</w:t>
+      </w:r>
+      <w:r>
+        <w:rPr>
+          <w:i/>
+          <w:iCs/>
+        </w:rPr>
+        <w:t xml:space="preserve">, README.</w:t>
+      </w:r>
+      <w:r>
+        <w:t xml:space="preserve"> </w:t>
+      </w:r>
+      <w:r>
+        <w:t xml:space="preserve">and docs/qa/BOB-</w:t>
+      </w:r>
+      <w:r>
+        <w:rPr>
+          <w:i/>
+          <w:iCs/>
+        </w:rPr>
+        <w:t xml:space="preserve">/closure_evidence_</w:t>
+      </w:r>
+      <w:r>
+        <w:t xml:space="preserve">.docx export twins</w:t>
+      </w:r>
+    </w:p>
+    <w:p>
+      <w:pPr>
+        <w:pStyle w:val="BodyText"/>
+      </w:pPr>
+      <w:r>
+        <w:rPr>
+          <w:b/>
+          <w:bCs/>
+        </w:rPr>
+        <w:t xml:space="preserve">Reproduction / context:</w:t>
+      </w:r>
+      <w:r>
+        <w:t xml:space="preserve"> </w:t>
+      </w:r>
+      <w:r>
+        <w:t xml:space="preserve">Run</w:t>
+      </w:r>
+      <w:r>
+        <w:t xml:space="preserve"> </w:t>
+      </w:r>
+      <w:r>
+        <w:t xml:space="preserve">‘ionice -c 3 nice -n 19 bash scripts/pre_build_verification.sh’</w:t>
+      </w:r>
+      <w:r>
+        <w:t xml:space="preserve"> </w:t>
+      </w:r>
+      <w:r>
+        <w:t xml:space="preserve">on a clean tree. Invariant 30 FAILs:</w:t>
+      </w:r>
+      <w:r>
+        <w:t xml:space="preserve"> </w:t>
+      </w:r>
+      <w:r>
+        <w:t xml:space="preserve">‘N tracked file(s) mtime-moved while the bash suite ran’</w:t>
+      </w:r>
+      <w:r>
+        <w:t xml:space="preserve"> </w:t>
+      </w:r>
+      <w:r>
+        <w:t xml:space="preserve">and the rewritten files show as modified in git status (byte changes only in the generated .docx/.html/.pdf twins; the Markdown sources are unchanged). Measured 2026-09-26: at merge-base 120fd78 (old constitution pin 25980c1) 15 files moved (README, Fixed, Fixed_Summary, Issues, Issues_Summary twins); at main 88767fc 18 files moved (adds docx twins of several docs/qa closure evidence files and the quickstart evidence). Restoring the files with git checkout makes the tree clean again. Running six export-related tests from tests/unit one at a time (test_docx_export, test_export_pdf_charset_integrity, test_export_staleness_oracle, test_generate_markdown_exports_path_arg, test_pre_build_workable_items_invariant, test_update_readme_doc_links_no_duplication) did NOT move the files, so the writer is UNCONFIRMED. Earlier commit ea8ffed documents a similar side effect attributed to workable-items-export.sh, which is a resemblance not a diagnosis.</w:t>
+      </w:r>
+    </w:p>
+    <w:p>
+      <w:pPr>
+        <w:pStyle w:val="BodyText"/>
+      </w:pPr>
+      <w:r>
+        <w:rPr>
+          <w:b/>
+          <w:bCs/>
+        </w:rPr>
+        <w:t xml:space="preserve">Acceptance criteria:</w:t>
+      </w:r>
+      <w:r>
+        <w:t xml:space="preserve"> </w:t>
+      </w:r>
+      <w:r>
+        <w:t xml:space="preserve">Root cause of the writer is identified with captured evidence (bisect the bash suite and the sweep stages that run before invariant 30, with a control needle proving the mtime instrument sees a known write); the writer either stops touching tracked twins during the sweep or writes only when sources changed (idempotent, byte-stable output); a test fails against the current behaviour and passes after; a full pre_build sweep on a clean tree leaves git status clean and invariant 30 PASS.</w:t>
+      </w:r>
+    </w:p>
     <w:bookmarkEnd w:id="215"/>
+    <w:bookmarkEnd w:id="216"/>
     <w:sectPr>
       <w:footnotePr>
         <w:numRestart w:val="eachSect"/>

</xml_diff>